<commit_message>
doc: relatorios de execucao da bateria de testes no Apendice J
- adiciona o relatorio consolidado da execucao (196 casos, sem falhas)
  e as saidas individuais do Maven Surefire, conforme citado na
  Secao 8.4 e no texto do Apendice J
- corrige o tempo verbal do Apendice K, cujos documentos de apoio ao
  usuario final ja acompanham o relatorio
</commit_message>
<xml_diff>
--- a/FAI-SI-PFC-II-FalaCidade-2026-v1.13.docx
+++ b/FAI-SI-PFC-II-FalaCidade-2026-v1.13.docx
@@ -3559,7 +3559,11 @@
     </w:p>
     <w:p>
       <w:pPr>
-        <w:pBdr/>
+        <w:pStyle w:val="1847"/>
+        <w:pBdr/>
+        <w:tabs>
+          <w:tab w:val="right" w:leader="dot" w:pos="9072"/>
+        </w:tabs>
         <w:spacing/>
         <w:ind/>
         <w:rPr/>
@@ -3582,16 +3586,472 @@
         </w:rPr>
         <w:fldChar w:fldCharType="separate"/>
       </w:r>
-      <w:r>
-        <w:rPr>
-          <w:b/>
-        </w:rPr>
-        <w:t xml:space="preserve">Nenhuma entrada de tabela de figuras encontrada.</w:t>
-      </w:r>
-      <w:r/>
-    </w:p>
-    <w:p>
-      <w:pPr>
+      <w:r/>
+      <w:hyperlink w:tooltip="#_Toc1" w:anchor="_Toc1" w:history="1">
+        <w:r>
+          <w:rPr>
+            <w:rStyle w:val="1828"/>
+          </w:rPr>
+        </w:r>
+        <w:r>
+          <w:rPr>
+            <w:rStyle w:val="1828"/>
+          </w:rPr>
+          <w:t xml:space="preserve">FIGURA </w:t>
+        </w:r>
+        <w:r>
+          <w:rPr>
+            <w:rStyle w:val="1828"/>
+          </w:rPr>
+          <w:t xml:space="preserve">1</w:t>
+        </w:r>
+        <w:r>
+          <w:rPr>
+            <w:rStyle w:val="1828"/>
+          </w:rPr>
+          <w:t xml:space="preserve"> – Interface de consulta do aplicativo </w:t>
+        </w:r>
+        <w:r>
+          <w:rPr>
+            <w:rStyle w:val="1828"/>
+          </w:rPr>
+          <w:t xml:space="preserve">Colab</w:t>
+        </w:r>
+        <w:r>
+          <w:rPr>
+            <w:rStyle w:val="1828"/>
+          </w:rPr>
+        </w:r>
+        <w:r>
+          <w:tab/>
+        </w:r>
+        <w:r>
+          <w:fldChar w:fldCharType="begin"/>
+          <w:instrText xml:space="preserve">PAGEREF _Toc1 \h</w:instrText>
+          <w:fldChar w:fldCharType="separate"/>
+          <w:t xml:space="preserve">23</w:t>
+          <w:fldChar w:fldCharType="end"/>
+        </w:r>
+      </w:hyperlink>
+      <w:r/>
+    </w:p>
+    <w:p>
+      <w:pPr>
+        <w:pStyle w:val="1847"/>
+        <w:pBdr/>
+        <w:tabs>
+          <w:tab w:val="right" w:leader="dot" w:pos="9072"/>
+        </w:tabs>
+        <w:spacing/>
+        <w:ind/>
+        <w:rPr/>
+      </w:pPr>
+      <w:hyperlink w:tooltip="#_Toc2" w:anchor="_Toc2" w:history="1">
+        <w:r>
+          <w:rPr>
+            <w:rStyle w:val="1828"/>
+          </w:rPr>
+        </w:r>
+        <w:r>
+          <w:rPr>
+            <w:rStyle w:val="1828"/>
+          </w:rPr>
+          <w:t xml:space="preserve">FIGURA </w:t>
+        </w:r>
+        <w:r>
+          <w:rPr>
+            <w:rStyle w:val="1828"/>
+          </w:rPr>
+          <w:t xml:space="preserve">2</w:t>
+        </w:r>
+        <w:r>
+          <w:rPr>
+            <w:rStyle w:val="1828"/>
+          </w:rPr>
+          <w:t xml:space="preserve"> - Interface de</w:t>
+        </w:r>
+        <w:r>
+          <w:rPr>
+            <w:rStyle w:val="1828"/>
+            <w:i/>
+          </w:rPr>
+          <w:t xml:space="preserve"> feed</w:t>
+        </w:r>
+        <w:r>
+          <w:rPr>
+            <w:rStyle w:val="1828"/>
+          </w:rPr>
+          <w:t xml:space="preserve"> do aplicativo </w:t>
+        </w:r>
+        <w:r>
+          <w:rPr>
+            <w:rStyle w:val="1828"/>
+          </w:rPr>
+          <w:t xml:space="preserve">Colab</w:t>
+        </w:r>
+        <w:r>
+          <w:rPr>
+            <w:rStyle w:val="1828"/>
+          </w:rPr>
+        </w:r>
+        <w:r>
+          <w:tab/>
+        </w:r>
+        <w:r>
+          <w:fldChar w:fldCharType="begin"/>
+          <w:instrText xml:space="preserve">PAGEREF _Toc2 \h</w:instrText>
+          <w:fldChar w:fldCharType="separate"/>
+          <w:t xml:space="preserve">23</w:t>
+          <w:fldChar w:fldCharType="end"/>
+        </w:r>
+      </w:hyperlink>
+      <w:r/>
+    </w:p>
+    <w:p>
+      <w:pPr>
+        <w:pStyle w:val="1847"/>
+        <w:pBdr/>
+        <w:tabs>
+          <w:tab w:val="right" w:leader="dot" w:pos="9072"/>
+        </w:tabs>
+        <w:spacing/>
+        <w:ind/>
+        <w:rPr/>
+      </w:pPr>
+      <w:hyperlink w:tooltip="#_Toc3" w:anchor="_Toc3" w:history="1">
+        <w:r>
+          <w:rPr>
+            <w:rStyle w:val="1828"/>
+          </w:rPr>
+        </w:r>
+        <w:r>
+          <w:rPr>
+            <w:rStyle w:val="1828"/>
+          </w:rPr>
+          <w:t xml:space="preserve">FIGURA </w:t>
+        </w:r>
+        <w:r>
+          <w:rPr>
+            <w:rStyle w:val="1828"/>
+          </w:rPr>
+          <w:t xml:space="preserve">3</w:t>
+        </w:r>
+        <w:r>
+          <w:rPr>
+            <w:rStyle w:val="1828"/>
+          </w:rPr>
+          <w:t xml:space="preserve"> - Seleção da unidade da federação na plataforma e-Ouve </w:t>
+        </w:r>
+        <w:r>
+          <w:rPr>
+            <w:rStyle w:val="1828"/>
+          </w:rPr>
+        </w:r>
+        <w:r>
+          <w:tab/>
+        </w:r>
+        <w:r>
+          <w:fldChar w:fldCharType="begin"/>
+          <w:instrText xml:space="preserve">PAGEREF _Toc3 \h</w:instrText>
+          <w:fldChar w:fldCharType="separate"/>
+          <w:t xml:space="preserve">24</w:t>
+          <w:fldChar w:fldCharType="end"/>
+        </w:r>
+      </w:hyperlink>
+      <w:r/>
+    </w:p>
+    <w:p>
+      <w:pPr>
+        <w:pStyle w:val="1847"/>
+        <w:pBdr/>
+        <w:tabs>
+          <w:tab w:val="right" w:leader="dot" w:pos="9072"/>
+        </w:tabs>
+        <w:spacing/>
+        <w:ind/>
+        <w:rPr/>
+      </w:pPr>
+      <w:hyperlink w:tooltip="#_Toc4" w:anchor="_Toc4" w:history="1">
+        <w:r>
+          <w:rPr>
+            <w:rStyle w:val="1828"/>
+          </w:rPr>
+        </w:r>
+        <w:r>
+          <w:rPr>
+            <w:rStyle w:val="1828"/>
+          </w:rPr>
+          <w:t xml:space="preserve">FIGURA </w:t>
+        </w:r>
+        <w:r>
+          <w:rPr>
+            <w:rStyle w:val="1828"/>
+          </w:rPr>
+          <w:t xml:space="preserve">4</w:t>
+        </w:r>
+        <w:r>
+          <w:rPr>
+            <w:rStyle w:val="1828"/>
+          </w:rPr>
+          <w:t xml:space="preserve"> - Seleção de serviços na plataforma e-Ouve</w:t>
+        </w:r>
+        <w:r>
+          <w:rPr>
+            <w:rStyle w:val="1828"/>
+          </w:rPr>
+        </w:r>
+        <w:r>
+          <w:tab/>
+        </w:r>
+        <w:r>
+          <w:fldChar w:fldCharType="begin"/>
+          <w:instrText xml:space="preserve">PAGEREF _Toc4 \h</w:instrText>
+          <w:fldChar w:fldCharType="separate"/>
+          <w:t xml:space="preserve">25</w:t>
+          <w:fldChar w:fldCharType="end"/>
+        </w:r>
+      </w:hyperlink>
+      <w:r/>
+    </w:p>
+    <w:p>
+      <w:pPr>
+        <w:pStyle w:val="1847"/>
+        <w:pBdr/>
+        <w:tabs>
+          <w:tab w:val="right" w:leader="dot" w:pos="9072"/>
+        </w:tabs>
+        <w:spacing/>
+        <w:ind/>
+        <w:rPr/>
+      </w:pPr>
+      <w:hyperlink w:tooltip="#_Toc5" w:anchor="_Toc5" w:history="1">
+        <w:r>
+          <w:rPr>
+            <w:rStyle w:val="1828"/>
+          </w:rPr>
+        </w:r>
+        <w:r>
+          <w:rPr>
+            <w:rStyle w:val="1828"/>
+          </w:rPr>
+          <w:t xml:space="preserve">FIGURA </w:t>
+        </w:r>
+        <w:r>
+          <w:rPr>
+            <w:rStyle w:val="1828"/>
+          </w:rPr>
+          <w:t xml:space="preserve">5</w:t>
+        </w:r>
+        <w:r>
+          <w:rPr>
+            <w:rStyle w:val="1828"/>
+          </w:rPr>
+          <w:t xml:space="preserve"> - Estrutura do repositório remoto no GitHub</w:t>
+        </w:r>
+        <w:r>
+          <w:rPr>
+            <w:rStyle w:val="1828"/>
+          </w:rPr>
+        </w:r>
+        <w:r>
+          <w:tab/>
+        </w:r>
+        <w:r>
+          <w:fldChar w:fldCharType="begin"/>
+          <w:instrText xml:space="preserve">PAGEREF _Toc5 \h</w:instrText>
+          <w:fldChar w:fldCharType="separate"/>
+          <w:t xml:space="preserve">42</w:t>
+          <w:fldChar w:fldCharType="end"/>
+        </w:r>
+      </w:hyperlink>
+      <w:r/>
+    </w:p>
+    <w:p>
+      <w:pPr>
+        <w:pStyle w:val="1847"/>
+        <w:pBdr/>
+        <w:tabs>
+          <w:tab w:val="right" w:leader="dot" w:pos="9072"/>
+        </w:tabs>
+        <w:spacing/>
+        <w:ind/>
+        <w:rPr/>
+      </w:pPr>
+      <w:hyperlink w:tooltip="#_Toc6" w:anchor="_Toc6" w:history="1">
+        <w:r>
+          <w:rPr>
+            <w:rStyle w:val="1828"/>
+          </w:rPr>
+        </w:r>
+        <w:r>
+          <w:rPr>
+            <w:rStyle w:val="1828"/>
+          </w:rPr>
+          <w:t xml:space="preserve">FIGURA </w:t>
+        </w:r>
+        <w:r>
+          <w:rPr>
+            <w:rStyle w:val="1828"/>
+          </w:rPr>
+          <w:t xml:space="preserve">6</w:t>
+        </w:r>
+        <w:r>
+          <w:rPr>
+            <w:rStyle w:val="1828"/>
+          </w:rPr>
+          <w:t xml:space="preserve"> </w:t>
+        </w:r>
+        <w:r>
+          <w:rPr>
+            <w:rStyle w:val="1828"/>
+          </w:rPr>
+          <w:t xml:space="preserve">-  Perfil</w:t>
+        </w:r>
+        <w:r>
+          <w:rPr>
+            <w:rStyle w:val="1828"/>
+          </w:rPr>
+          <w:t xml:space="preserve"> de usuário do respondente</w:t>
+        </w:r>
+        <w:r>
+          <w:rPr>
+            <w:rStyle w:val="1828"/>
+          </w:rPr>
+        </w:r>
+        <w:r>
+          <w:tab/>
+        </w:r>
+        <w:r>
+          <w:fldChar w:fldCharType="begin"/>
+          <w:instrText xml:space="preserve">PAGEREF _Toc6 \h</w:instrText>
+          <w:fldChar w:fldCharType="separate"/>
+          <w:t xml:space="preserve">61</w:t>
+          <w:fldChar w:fldCharType="end"/>
+        </w:r>
+      </w:hyperlink>
+      <w:r/>
+    </w:p>
+    <w:p>
+      <w:pPr>
+        <w:pStyle w:val="1847"/>
+        <w:pBdr/>
+        <w:tabs>
+          <w:tab w:val="right" w:leader="dot" w:pos="9072"/>
+        </w:tabs>
+        <w:spacing/>
+        <w:ind/>
+        <w:rPr/>
+      </w:pPr>
+      <w:hyperlink w:tooltip="#_Toc7" w:anchor="_Toc7" w:history="1">
+        <w:r>
+          <w:rPr>
+            <w:rStyle w:val="1828"/>
+          </w:rPr>
+        </w:r>
+        <w:r>
+          <w:rPr>
+            <w:rStyle w:val="1828"/>
+          </w:rPr>
+          <w:t xml:space="preserve">FIGURA </w:t>
+        </w:r>
+        <w:r>
+          <w:rPr>
+            <w:rStyle w:val="1828"/>
+          </w:rPr>
+          <w:t xml:space="preserve">7</w:t>
+        </w:r>
+        <w:r>
+          <w:rPr>
+            <w:rStyle w:val="1828"/>
+          </w:rPr>
+          <w:t xml:space="preserve"> </w:t>
+        </w:r>
+        <w:r>
+          <w:rPr>
+            <w:rStyle w:val="1828"/>
+          </w:rPr>
+          <w:t xml:space="preserve">–  Experiência</w:t>
+        </w:r>
+        <w:r>
+          <w:rPr>
+            <w:rStyle w:val="1828"/>
+          </w:rPr>
+          <w:t xml:space="preserve"> com aplicativos para registro de problemas da cidade</w:t>
+        </w:r>
+        <w:r>
+          <w:rPr>
+            <w:rStyle w:val="1828"/>
+          </w:rPr>
+        </w:r>
+        <w:r>
+          <w:tab/>
+        </w:r>
+        <w:r>
+          <w:fldChar w:fldCharType="begin"/>
+          <w:instrText xml:space="preserve">PAGEREF _Toc7 \h</w:instrText>
+          <w:fldChar w:fldCharType="separate"/>
+          <w:t xml:space="preserve">62</w:t>
+          <w:fldChar w:fldCharType="end"/>
+        </w:r>
+      </w:hyperlink>
+      <w:r/>
+    </w:p>
+    <w:p>
+      <w:pPr>
+        <w:pStyle w:val="1847"/>
+        <w:pBdr/>
+        <w:tabs>
+          <w:tab w:val="right" w:leader="dot" w:pos="9072"/>
+        </w:tabs>
+        <w:spacing/>
+        <w:ind/>
+        <w:rPr/>
+      </w:pPr>
+      <w:hyperlink w:tooltip="#_Toc8" w:anchor="_Toc8" w:history="1">
+        <w:r>
+          <w:rPr>
+            <w:rStyle w:val="1828"/>
+          </w:rPr>
+        </w:r>
+        <w:r>
+          <w:rPr>
+            <w:rStyle w:val="1828"/>
+          </w:rPr>
+          <w:t xml:space="preserve">FIGURA </w:t>
+        </w:r>
+        <w:r>
+          <w:rPr>
+            <w:rStyle w:val="1828"/>
+          </w:rPr>
+          <w:t xml:space="preserve">8</w:t>
+        </w:r>
+        <w:r>
+          <w:rPr>
+            <w:rStyle w:val="1828"/>
+          </w:rPr>
+          <w:t xml:space="preserve"> – Possibilidade de uso de um aplicativo para registrar ocorrências da cidade.</w:t>
+        </w:r>
+        <w:r>
+          <w:rPr>
+            <w:rStyle w:val="1828"/>
+          </w:rPr>
+        </w:r>
+        <w:r>
+          <w:tab/>
+        </w:r>
+        <w:r>
+          <w:fldChar w:fldCharType="begin"/>
+          <w:instrText xml:space="preserve">PAGEREF _Toc8 \h</w:instrText>
+          <w:fldChar w:fldCharType="separate"/>
+          <w:t xml:space="preserve">63</w:t>
+          <w:fldChar w:fldCharType="end"/>
+        </w:r>
+      </w:hyperlink>
+      <w:r/>
+    </w:p>
+    <w:p>
+      <w:pPr>
+        <w:pStyle w:val="1830"/>
         <w:pBdr/>
         <w:spacing/>
         <w:ind/>
@@ -3602,24 +4062,10 @@
           <w:caps w:val="0"/>
         </w:rPr>
       </w:r>
-      <w:r/>
-    </w:p>
-    <w:p>
-      <w:pPr>
-        <w:pStyle w:val="1830"/>
-        <w:pBdr/>
-        <w:spacing/>
-        <w:ind/>
-        <w:rPr/>
-      </w:pPr>
-      <w:r>
-        <w:rPr>
-          <w:caps w:val="0"/>
-        </w:rPr>
-      </w:r>
       <w:r>
         <w:fldChar w:fldCharType="end"/>
       </w:r>
+      <w:r/>
       <w:r/>
     </w:p>
     <w:p>
@@ -3670,6 +4116,7 @@
       <w:r>
         <w:fldChar w:fldCharType="separate"/>
       </w:r>
+      <w:r/>
       <w:hyperlink w:tooltip="#_Toc1" w:anchor="_Toc1" w:history="1">
         <w:r>
           <w:rPr>
@@ -3706,12 +4153,11 @@
           <w:fldChar w:fldCharType="begin"/>
           <w:instrText xml:space="preserve">PAGEREF _Toc1 \h</w:instrText>
           <w:fldChar w:fldCharType="separate"/>
-          <w:t xml:space="preserve">83</w:t>
+          <w:t xml:space="preserve">82</w:t>
           <w:fldChar w:fldCharType="end"/>
         </w:r>
       </w:hyperlink>
       <w:r/>
-      <w:r/>
     </w:p>
     <w:p>
       <w:pPr>
@@ -3724,7 +4170,6 @@
         <w:ind/>
         <w:rPr/>
       </w:pPr>
-      <w:r/>
       <w:hyperlink w:tooltip="#_Toc2" w:anchor="_Toc2" w:history="1">
         <w:r>
           <w:rPr>
@@ -3761,12 +4206,11 @@
           <w:fldChar w:fldCharType="begin"/>
           <w:instrText xml:space="preserve">PAGEREF _Toc2 \h</w:instrText>
           <w:fldChar w:fldCharType="separate"/>
-          <w:t xml:space="preserve">84</w:t>
+          <w:t xml:space="preserve">83</w:t>
           <w:fldChar w:fldCharType="end"/>
         </w:r>
       </w:hyperlink>
       <w:r/>
-      <w:r/>
     </w:p>
     <w:p>
       <w:pPr>
@@ -3779,7 +4223,6 @@
         <w:ind/>
         <w:rPr/>
       </w:pPr>
-      <w:r/>
       <w:hyperlink w:tooltip="#_Toc3" w:anchor="_Toc3" w:history="1">
         <w:r>
           <w:rPr>
@@ -3816,12 +4259,11 @@
           <w:fldChar w:fldCharType="begin"/>
           <w:instrText xml:space="preserve">PAGEREF _Toc3 \h</w:instrText>
           <w:fldChar w:fldCharType="separate"/>
-          <w:t xml:space="preserve">85</w:t>
+          <w:t xml:space="preserve">84</w:t>
           <w:fldChar w:fldCharType="end"/>
         </w:r>
       </w:hyperlink>
       <w:r/>
-      <w:r/>
     </w:p>
     <w:p>
       <w:pPr>
@@ -3834,9 +4276,11 @@
         <w:ind/>
         <w:rPr/>
       </w:pPr>
+      <w:r/>
       <w:r>
         <w:fldChar w:fldCharType="end"/>
       </w:r>
+      <w:r/>
       <w:r/>
     </w:p>
     <w:p>
@@ -8278,6 +8722,7 @@
         </w:rPr>
         <w:fldChar w:fldCharType="separate"/>
       </w:r>
+      <w:r/>
       <w:hyperlink w:tooltip="#_Toc1" w:anchor="_Toc1" w:history="1">
         <w:r>
           <w:rPr>
@@ -8307,7 +8752,6 @@
         </w:r>
       </w:hyperlink>
       <w:r/>
-      <w:r/>
     </w:p>
     <w:p>
       <w:pPr>
@@ -8320,7 +8764,6 @@
         <w:ind/>
         <w:rPr/>
       </w:pPr>
-      <w:r/>
       <w:hyperlink w:tooltip="#_Toc2" w:anchor="_Toc2" w:history="1">
         <w:r>
           <w:rPr>
@@ -8350,7 +8793,6 @@
         </w:r>
       </w:hyperlink>
       <w:r/>
-      <w:r/>
     </w:p>
     <w:p>
       <w:pPr>
@@ -8363,7 +8805,6 @@
         <w:ind/>
         <w:rPr/>
       </w:pPr>
-      <w:r/>
       <w:hyperlink w:tooltip="#_Toc3" w:anchor="_Toc3" w:history="1">
         <w:r>
           <w:rPr>
@@ -8393,7 +8834,6 @@
         </w:r>
       </w:hyperlink>
       <w:r/>
-      <w:r/>
     </w:p>
     <w:p>
       <w:pPr>
@@ -8406,7 +8846,6 @@
         <w:ind/>
         <w:rPr/>
       </w:pPr>
-      <w:r/>
       <w:hyperlink w:tooltip="#_Toc4" w:anchor="_Toc4" w:history="1">
         <w:r>
           <w:rPr>
@@ -8436,7 +8875,6 @@
         </w:r>
       </w:hyperlink>
       <w:r/>
-      <w:r/>
     </w:p>
     <w:p>
       <w:pPr>
@@ -8449,7 +8887,6 @@
         <w:ind/>
         <w:rPr/>
       </w:pPr>
-      <w:r/>
       <w:hyperlink w:tooltip="#_Toc5" w:anchor="_Toc5" w:history="1">
         <w:r>
           <w:rPr>
@@ -8479,7 +8916,6 @@
         </w:r>
       </w:hyperlink>
       <w:r/>
-      <w:r/>
     </w:p>
     <w:p>
       <w:pPr>
@@ -8492,7 +8928,6 @@
         <w:ind/>
         <w:rPr/>
       </w:pPr>
-      <w:r/>
       <w:hyperlink w:tooltip="#_Toc6" w:anchor="_Toc6" w:history="1">
         <w:r>
           <w:rPr>
@@ -8522,7 +8957,6 @@
         </w:r>
       </w:hyperlink>
       <w:r/>
-      <w:r/>
     </w:p>
     <w:p>
       <w:pPr>
@@ -8535,7 +8969,6 @@
         <w:ind/>
         <w:rPr/>
       </w:pPr>
-      <w:r/>
       <w:hyperlink w:tooltip="#_Toc7" w:anchor="_Toc7" w:history="1">
         <w:r>
           <w:rPr>
@@ -8566,7 +8999,6 @@
         </w:r>
       </w:hyperlink>
       <w:r/>
-      <w:r/>
     </w:p>
     <w:p>
       <w:pPr>
@@ -8579,7 +9011,6 @@
         <w:ind/>
         <w:rPr/>
       </w:pPr>
-      <w:r/>
       <w:hyperlink w:tooltip="#_Toc8" w:anchor="_Toc8" w:history="1">
         <w:r>
           <w:rPr>
@@ -8609,7 +9040,6 @@
         </w:r>
       </w:hyperlink>
       <w:r/>
-      <w:r/>
     </w:p>
     <w:p>
       <w:pPr>
@@ -8622,7 +9052,6 @@
         <w:ind/>
         <w:rPr/>
       </w:pPr>
-      <w:r/>
       <w:hyperlink w:tooltip="#_Toc9" w:anchor="_Toc9" w:history="1">
         <w:r>
           <w:rPr>
@@ -8652,7 +9081,6 @@
         </w:r>
       </w:hyperlink>
       <w:r/>
-      <w:r/>
     </w:p>
     <w:p>
       <w:pPr>
@@ -8665,7 +9093,6 @@
         <w:ind/>
         <w:rPr/>
       </w:pPr>
-      <w:r/>
       <w:hyperlink w:tooltip="#_Toc10" w:anchor="_Toc10" w:history="1">
         <w:r>
           <w:rPr>
@@ -8695,7 +9122,6 @@
         </w:r>
       </w:hyperlink>
       <w:r/>
-      <w:r/>
     </w:p>
     <w:p>
       <w:pPr>
@@ -8708,7 +9134,6 @@
         <w:ind/>
         <w:rPr/>
       </w:pPr>
-      <w:r/>
       <w:hyperlink w:tooltip="#_Toc11" w:anchor="_Toc11" w:history="1">
         <w:r>
           <w:rPr>
@@ -8738,7 +9163,6 @@
         </w:r>
       </w:hyperlink>
       <w:r/>
-      <w:r/>
     </w:p>
     <w:p>
       <w:pPr>
@@ -8751,7 +9175,6 @@
         <w:ind/>
         <w:rPr/>
       </w:pPr>
-      <w:r/>
       <w:hyperlink w:tooltip="#_Toc12" w:anchor="_Toc12" w:history="1">
         <w:r>
           <w:rPr>
@@ -8781,7 +9204,6 @@
         </w:r>
       </w:hyperlink>
       <w:r/>
-      <w:r/>
     </w:p>
     <w:p>
       <w:pPr>
@@ -8794,7 +9216,6 @@
         <w:ind/>
         <w:rPr/>
       </w:pPr>
-      <w:r/>
       <w:hyperlink w:tooltip="#_Toc13" w:anchor="_Toc13" w:history="1">
         <w:r>
           <w:rPr>
@@ -8824,7 +9245,6 @@
         </w:r>
       </w:hyperlink>
       <w:r/>
-      <w:r/>
     </w:p>
     <w:p>
       <w:pPr>
@@ -8837,7 +9257,6 @@
         <w:ind/>
         <w:rPr/>
       </w:pPr>
-      <w:r/>
       <w:hyperlink w:tooltip="#_Toc14" w:anchor="_Toc14" w:history="1">
         <w:r>
           <w:rPr>
@@ -8867,7 +9286,6 @@
         </w:r>
       </w:hyperlink>
       <w:r/>
-      <w:r/>
     </w:p>
     <w:p>
       <w:pPr>
@@ -8880,7 +9298,6 @@
         <w:ind/>
         <w:rPr/>
       </w:pPr>
-      <w:r/>
       <w:hyperlink w:tooltip="#_Toc15" w:anchor="_Toc15" w:history="1">
         <w:r>
           <w:rPr>
@@ -8910,7 +9327,6 @@
         </w:r>
       </w:hyperlink>
       <w:r/>
-      <w:r/>
     </w:p>
     <w:p>
       <w:pPr>
@@ -8923,7 +9339,6 @@
         <w:ind/>
         <w:rPr/>
       </w:pPr>
-      <w:r/>
       <w:hyperlink w:tooltip="#_Toc16" w:anchor="_Toc16" w:history="1">
         <w:r>
           <w:rPr>
@@ -8953,7 +9368,6 @@
         </w:r>
       </w:hyperlink>
       <w:r/>
-      <w:r/>
     </w:p>
     <w:p>
       <w:pPr>
@@ -8966,7 +9380,6 @@
         <w:ind/>
         <w:rPr/>
       </w:pPr>
-      <w:r/>
       <w:hyperlink w:tooltip="#_Toc17" w:anchor="_Toc17" w:history="1">
         <w:r>
           <w:rPr>
@@ -8996,7 +9409,6 @@
         </w:r>
       </w:hyperlink>
       <w:r/>
-      <w:r/>
     </w:p>
     <w:p>
       <w:pPr>
@@ -9009,7 +9421,6 @@
         <w:ind/>
         <w:rPr/>
       </w:pPr>
-      <w:r/>
       <w:hyperlink w:tooltip="#_Toc18" w:anchor="_Toc18" w:history="1">
         <w:r>
           <w:rPr>
@@ -9039,7 +9450,6 @@
         </w:r>
       </w:hyperlink>
       <w:r/>
-      <w:r/>
     </w:p>
     <w:p>
       <w:pPr>
@@ -9052,7 +9462,6 @@
         <w:ind/>
         <w:rPr/>
       </w:pPr>
-      <w:r/>
       <w:hyperlink w:tooltip="#_Toc19" w:anchor="_Toc19" w:history="1">
         <w:r>
           <w:rPr>
@@ -9082,7 +9491,6 @@
         </w:r>
       </w:hyperlink>
       <w:r/>
-      <w:r/>
     </w:p>
     <w:p>
       <w:pPr>
@@ -9095,7 +9503,6 @@
         <w:ind/>
         <w:rPr/>
       </w:pPr>
-      <w:r/>
       <w:hyperlink w:tooltip="#_Toc20" w:anchor="_Toc20" w:history="1">
         <w:r>
           <w:rPr>
@@ -9125,7 +9532,6 @@
         </w:r>
       </w:hyperlink>
       <w:r/>
-      <w:r/>
     </w:p>
     <w:p>
       <w:pPr>
@@ -9138,7 +9544,6 @@
         <w:ind/>
         <w:rPr/>
       </w:pPr>
-      <w:r/>
       <w:hyperlink w:tooltip="#_Toc21" w:anchor="_Toc21" w:history="1">
         <w:r>
           <w:rPr>
@@ -9168,7 +9573,6 @@
         </w:r>
       </w:hyperlink>
       <w:r/>
-      <w:r/>
     </w:p>
     <w:p>
       <w:pPr>
@@ -9181,7 +9585,6 @@
         <w:ind/>
         <w:rPr/>
       </w:pPr>
-      <w:r/>
       <w:hyperlink w:tooltip="#_Toc22" w:anchor="_Toc22" w:history="1">
         <w:r>
           <w:rPr>
@@ -9211,7 +9614,6 @@
         </w:r>
       </w:hyperlink>
       <w:r/>
-      <w:r/>
     </w:p>
     <w:p>
       <w:pPr>
@@ -9224,7 +9626,6 @@
         <w:ind/>
         <w:rPr/>
       </w:pPr>
-      <w:r/>
       <w:hyperlink w:tooltip="#_Toc23" w:anchor="_Toc23" w:history="1">
         <w:r>
           <w:rPr>
@@ -9254,7 +9655,6 @@
         </w:r>
       </w:hyperlink>
       <w:r/>
-      <w:r/>
     </w:p>
     <w:p>
       <w:pPr>
@@ -9267,7 +9667,6 @@
         <w:ind/>
         <w:rPr/>
       </w:pPr>
-      <w:r/>
       <w:hyperlink w:tooltip="#_Toc24" w:anchor="_Toc24" w:history="1">
         <w:r>
           <w:rPr>
@@ -9297,7 +9696,6 @@
         </w:r>
       </w:hyperlink>
       <w:r/>
-      <w:r/>
     </w:p>
     <w:p>
       <w:pPr>
@@ -9311,7 +9709,6 @@
         <w:ind/>
         <w:rPr/>
       </w:pPr>
-      <w:r/>
       <w:hyperlink w:tooltip="#_Toc25" w:anchor="_Toc25" w:history="1">
         <w:r>
           <w:rPr>
@@ -9347,7 +9744,6 @@
         </w:r>
       </w:hyperlink>
       <w:r/>
-      <w:r/>
     </w:p>
     <w:p>
       <w:pPr>
@@ -9360,7 +9756,6 @@
         <w:ind/>
         <w:rPr/>
       </w:pPr>
-      <w:r/>
       <w:hyperlink w:tooltip="#_Toc26" w:anchor="_Toc26" w:history="1">
         <w:r>
           <w:rPr>
@@ -9390,7 +9785,6 @@
         </w:r>
       </w:hyperlink>
       <w:r/>
-      <w:r/>
     </w:p>
     <w:p>
       <w:pPr>
@@ -9403,7 +9797,6 @@
         <w:ind/>
         <w:rPr/>
       </w:pPr>
-      <w:r/>
       <w:hyperlink w:tooltip="#_Toc27" w:anchor="_Toc27" w:history="1">
         <w:r>
           <w:rPr>
@@ -9433,7 +9826,6 @@
         </w:r>
       </w:hyperlink>
       <w:r/>
-      <w:r/>
     </w:p>
     <w:p>
       <w:pPr>
@@ -9446,7 +9838,6 @@
         <w:ind/>
         <w:rPr/>
       </w:pPr>
-      <w:r/>
       <w:hyperlink w:tooltip="#_Toc28" w:anchor="_Toc28" w:history="1">
         <w:r>
           <w:rPr>
@@ -9476,7 +9867,6 @@
         </w:r>
       </w:hyperlink>
       <w:r/>
-      <w:r/>
     </w:p>
     <w:p>
       <w:pPr>
@@ -9489,7 +9879,6 @@
         <w:ind/>
         <w:rPr/>
       </w:pPr>
-      <w:r/>
       <w:hyperlink w:tooltip="#_Toc29" w:anchor="_Toc29" w:history="1">
         <w:r>
           <w:rPr>
@@ -9519,7 +9908,6 @@
         </w:r>
       </w:hyperlink>
       <w:r/>
-      <w:r/>
     </w:p>
     <w:p>
       <w:pPr>
@@ -9532,7 +9920,6 @@
         <w:ind/>
         <w:rPr/>
       </w:pPr>
-      <w:r/>
       <w:hyperlink w:tooltip="#_Toc30" w:anchor="_Toc30" w:history="1">
         <w:r>
           <w:rPr>
@@ -9562,7 +9949,6 @@
         </w:r>
       </w:hyperlink>
       <w:r/>
-      <w:r/>
     </w:p>
     <w:p>
       <w:pPr>
@@ -9575,7 +9961,6 @@
         <w:ind/>
         <w:rPr/>
       </w:pPr>
-      <w:r/>
       <w:hyperlink w:tooltip="#_Toc31" w:anchor="_Toc31" w:history="1">
         <w:r>
           <w:rPr>
@@ -9611,7 +9996,6 @@
         </w:r>
       </w:hyperlink>
       <w:r/>
-      <w:r/>
     </w:p>
     <w:p>
       <w:pPr>
@@ -9624,7 +10008,6 @@
         <w:ind/>
         <w:rPr/>
       </w:pPr>
-      <w:r/>
       <w:hyperlink w:tooltip="#_Toc32" w:anchor="_Toc32" w:history="1">
         <w:r>
           <w:rPr>
@@ -9654,7 +10037,6 @@
         </w:r>
       </w:hyperlink>
       <w:r/>
-      <w:r/>
     </w:p>
     <w:p>
       <w:pPr>
@@ -9667,7 +10049,6 @@
         <w:ind/>
         <w:rPr/>
       </w:pPr>
-      <w:r/>
       <w:hyperlink w:tooltip="#_Toc33" w:anchor="_Toc33" w:history="1">
         <w:r>
           <w:rPr>
@@ -9697,7 +10078,6 @@
         </w:r>
       </w:hyperlink>
       <w:r/>
-      <w:r/>
     </w:p>
     <w:p>
       <w:pPr>
@@ -9710,7 +10090,6 @@
         <w:ind/>
         <w:rPr/>
       </w:pPr>
-      <w:r/>
       <w:hyperlink w:tooltip="#_Toc34" w:anchor="_Toc34" w:history="1">
         <w:r>
           <w:rPr>
@@ -9740,7 +10119,6 @@
         </w:r>
       </w:hyperlink>
       <w:r/>
-      <w:r/>
     </w:p>
     <w:p>
       <w:pPr>
@@ -9753,7 +10131,6 @@
         <w:ind/>
         <w:rPr/>
       </w:pPr>
-      <w:r/>
       <w:hyperlink w:tooltip="#_Toc35" w:anchor="_Toc35" w:history="1">
         <w:r>
           <w:rPr>
@@ -9783,7 +10160,6 @@
         </w:r>
       </w:hyperlink>
       <w:r/>
-      <w:r/>
     </w:p>
     <w:p>
       <w:pPr>
@@ -9796,7 +10172,6 @@
         <w:ind/>
         <w:rPr/>
       </w:pPr>
-      <w:r/>
       <w:hyperlink w:tooltip="#_Toc36" w:anchor="_Toc36" w:history="1">
         <w:r>
           <w:rPr>
@@ -9826,7 +10201,6 @@
         </w:r>
       </w:hyperlink>
       <w:r/>
-      <w:r/>
     </w:p>
     <w:p>
       <w:pPr>
@@ -9839,7 +10213,6 @@
         <w:ind/>
         <w:rPr/>
       </w:pPr>
-      <w:r/>
       <w:hyperlink w:tooltip="#_Toc37" w:anchor="_Toc37" w:history="1">
         <w:r>
           <w:rPr>
@@ -9864,12 +10237,11 @@
           <w:fldChar w:fldCharType="begin"/>
           <w:instrText xml:space="preserve">PAGEREF _Toc37 \h</w:instrText>
           <w:fldChar w:fldCharType="separate"/>
-          <w:t xml:space="preserve">58</w:t>
+          <w:t xml:space="preserve">57</w:t>
           <w:fldChar w:fldCharType="end"/>
         </w:r>
       </w:hyperlink>
       <w:r/>
-      <w:r/>
     </w:p>
     <w:p>
       <w:pPr>
@@ -9882,7 +10254,6 @@
         <w:ind/>
         <w:rPr/>
       </w:pPr>
-      <w:r/>
       <w:hyperlink w:tooltip="#_Toc38" w:anchor="_Toc38" w:history="1">
         <w:r>
           <w:rPr>
@@ -9907,12 +10278,11 @@
           <w:fldChar w:fldCharType="begin"/>
           <w:instrText xml:space="preserve">PAGEREF _Toc38 \h</w:instrText>
           <w:fldChar w:fldCharType="separate"/>
-          <w:t xml:space="preserve">58</w:t>
+          <w:t xml:space="preserve">57</w:t>
           <w:fldChar w:fldCharType="end"/>
         </w:r>
       </w:hyperlink>
       <w:r/>
-      <w:r/>
     </w:p>
     <w:p>
       <w:pPr>
@@ -9925,7 +10295,6 @@
         <w:ind/>
         <w:rPr/>
       </w:pPr>
-      <w:r/>
       <w:hyperlink w:tooltip="#_Toc39" w:anchor="_Toc39" w:history="1">
         <w:r>
           <w:rPr>
@@ -9950,12 +10319,11 @@
           <w:fldChar w:fldCharType="begin"/>
           <w:instrText xml:space="preserve">PAGEREF _Toc39 \h</w:instrText>
           <w:fldChar w:fldCharType="separate"/>
-          <w:t xml:space="preserve">58</w:t>
+          <w:t xml:space="preserve">57</w:t>
           <w:fldChar w:fldCharType="end"/>
         </w:r>
       </w:hyperlink>
       <w:r/>
-      <w:r/>
     </w:p>
     <w:p>
       <w:pPr>
@@ -9968,7 +10336,6 @@
         <w:ind/>
         <w:rPr/>
       </w:pPr>
-      <w:r/>
       <w:hyperlink w:tooltip="#_Toc40" w:anchor="_Toc40" w:history="1">
         <w:r>
           <w:rPr>
@@ -9993,12 +10360,11 @@
           <w:fldChar w:fldCharType="begin"/>
           <w:instrText xml:space="preserve">PAGEREF _Toc40 \h</w:instrText>
           <w:fldChar w:fldCharType="separate"/>
-          <w:t xml:space="preserve">59</w:t>
+          <w:t xml:space="preserve">58</w:t>
           <w:fldChar w:fldCharType="end"/>
         </w:r>
       </w:hyperlink>
       <w:r/>
-      <w:r/>
     </w:p>
     <w:p>
       <w:pPr>
@@ -10011,7 +10377,6 @@
         <w:ind/>
         <w:rPr/>
       </w:pPr>
-      <w:r/>
       <w:hyperlink w:tooltip="#_Toc41" w:anchor="_Toc41" w:history="1">
         <w:r>
           <w:rPr>
@@ -10036,12 +10401,11 @@
           <w:fldChar w:fldCharType="begin"/>
           <w:instrText xml:space="preserve">PAGEREF _Toc41 \h</w:instrText>
           <w:fldChar w:fldCharType="separate"/>
-          <w:t xml:space="preserve">59</w:t>
+          <w:t xml:space="preserve">58</w:t>
           <w:fldChar w:fldCharType="end"/>
         </w:r>
       </w:hyperlink>
       <w:r/>
-      <w:r/>
     </w:p>
     <w:p>
       <w:pPr>
@@ -10054,7 +10418,6 @@
         <w:ind/>
         <w:rPr/>
       </w:pPr>
-      <w:r/>
       <w:hyperlink w:tooltip="#_Toc42" w:anchor="_Toc42" w:history="1">
         <w:r>
           <w:rPr>
@@ -10079,12 +10442,11 @@
           <w:fldChar w:fldCharType="begin"/>
           <w:instrText xml:space="preserve">PAGEREF _Toc42 \h</w:instrText>
           <w:fldChar w:fldCharType="separate"/>
-          <w:t xml:space="preserve">59</w:t>
+          <w:t xml:space="preserve">58</w:t>
           <w:fldChar w:fldCharType="end"/>
         </w:r>
       </w:hyperlink>
       <w:r/>
-      <w:r/>
     </w:p>
     <w:p>
       <w:pPr>
@@ -10097,7 +10459,6 @@
         <w:ind/>
         <w:rPr/>
       </w:pPr>
-      <w:r/>
       <w:hyperlink w:tooltip="#_Toc43" w:anchor="_Toc43" w:history="1">
         <w:r>
           <w:rPr>
@@ -10122,12 +10483,11 @@
           <w:fldChar w:fldCharType="begin"/>
           <w:instrText xml:space="preserve">PAGEREF _Toc43 \h</w:instrText>
           <w:fldChar w:fldCharType="separate"/>
-          <w:t xml:space="preserve">60</w:t>
+          <w:t xml:space="preserve">59</w:t>
           <w:fldChar w:fldCharType="end"/>
         </w:r>
       </w:hyperlink>
       <w:r/>
-      <w:r/>
     </w:p>
     <w:p>
       <w:pPr>
@@ -10140,7 +10500,6 @@
         <w:ind/>
         <w:rPr/>
       </w:pPr>
-      <w:r/>
       <w:hyperlink w:tooltip="#_Toc44" w:anchor="_Toc44" w:history="1">
         <w:r>
           <w:rPr>
@@ -10165,12 +10524,11 @@
           <w:fldChar w:fldCharType="begin"/>
           <w:instrText xml:space="preserve">PAGEREF _Toc44 \h</w:instrText>
           <w:fldChar w:fldCharType="separate"/>
-          <w:t xml:space="preserve">60</w:t>
+          <w:t xml:space="preserve">59</w:t>
           <w:fldChar w:fldCharType="end"/>
         </w:r>
       </w:hyperlink>
       <w:r/>
-      <w:r/>
     </w:p>
     <w:p>
       <w:pPr>
@@ -10183,7 +10541,6 @@
         <w:ind/>
         <w:rPr/>
       </w:pPr>
-      <w:r/>
       <w:hyperlink w:tooltip="#_Toc45" w:anchor="_Toc45" w:history="1">
         <w:r>
           <w:rPr>
@@ -10208,12 +10565,11 @@
           <w:fldChar w:fldCharType="begin"/>
           <w:instrText xml:space="preserve">PAGEREF _Toc45 \h</w:instrText>
           <w:fldChar w:fldCharType="separate"/>
-          <w:t xml:space="preserve">60</w:t>
+          <w:t xml:space="preserve">59</w:t>
           <w:fldChar w:fldCharType="end"/>
         </w:r>
       </w:hyperlink>
       <w:r/>
-      <w:r/>
     </w:p>
     <w:p>
       <w:pPr>
@@ -10226,7 +10582,6 @@
         <w:ind/>
         <w:rPr/>
       </w:pPr>
-      <w:r/>
       <w:hyperlink w:tooltip="#_Toc46" w:anchor="_Toc46" w:history="1">
         <w:r>
           <w:rPr>
@@ -10251,12 +10606,11 @@
           <w:fldChar w:fldCharType="begin"/>
           <w:instrText xml:space="preserve">PAGEREF _Toc46 \h</w:instrText>
           <w:fldChar w:fldCharType="separate"/>
-          <w:t xml:space="preserve">61</w:t>
+          <w:t xml:space="preserve">60</w:t>
           <w:fldChar w:fldCharType="end"/>
         </w:r>
       </w:hyperlink>
       <w:r/>
-      <w:r/>
     </w:p>
     <w:p>
       <w:pPr>
@@ -10269,7 +10623,6 @@
         <w:ind/>
         <w:rPr/>
       </w:pPr>
-      <w:r/>
       <w:hyperlink w:tooltip="#_Toc47" w:anchor="_Toc47" w:history="1">
         <w:r>
           <w:rPr>
@@ -10294,12 +10647,11 @@
           <w:fldChar w:fldCharType="begin"/>
           <w:instrText xml:space="preserve">PAGEREF _Toc47 \h</w:instrText>
           <w:fldChar w:fldCharType="separate"/>
-          <w:t xml:space="preserve">61</w:t>
+          <w:t xml:space="preserve">60</w:t>
           <w:fldChar w:fldCharType="end"/>
         </w:r>
       </w:hyperlink>
       <w:r/>
-      <w:r/>
     </w:p>
     <w:p>
       <w:pPr>
@@ -10312,7 +10664,6 @@
         <w:ind/>
         <w:rPr/>
       </w:pPr>
-      <w:r/>
       <w:hyperlink w:tooltip="#_Toc48" w:anchor="_Toc48" w:history="1">
         <w:r>
           <w:rPr>
@@ -10337,12 +10688,11 @@
           <w:fldChar w:fldCharType="begin"/>
           <w:instrText xml:space="preserve">PAGEREF _Toc48 \h</w:instrText>
           <w:fldChar w:fldCharType="separate"/>
-          <w:t xml:space="preserve">64</w:t>
+          <w:t xml:space="preserve">63</w:t>
           <w:fldChar w:fldCharType="end"/>
         </w:r>
       </w:hyperlink>
       <w:r/>
-      <w:r/>
     </w:p>
     <w:p>
       <w:pPr>
@@ -10355,7 +10705,6 @@
         <w:ind/>
         <w:rPr/>
       </w:pPr>
-      <w:r/>
       <w:hyperlink w:tooltip="#_Toc49" w:anchor="_Toc49" w:history="1">
         <w:r>
           <w:rPr>
@@ -10380,12 +10729,11 @@
           <w:fldChar w:fldCharType="begin"/>
           <w:instrText xml:space="preserve">PAGEREF _Toc49 \h</w:instrText>
           <w:fldChar w:fldCharType="separate"/>
-          <w:t xml:space="preserve">65</w:t>
+          <w:t xml:space="preserve">64</w:t>
           <w:fldChar w:fldCharType="end"/>
         </w:r>
       </w:hyperlink>
       <w:r/>
-      <w:r/>
     </w:p>
     <w:p>
       <w:pPr>
@@ -10398,7 +10746,6 @@
         <w:ind/>
         <w:rPr/>
       </w:pPr>
-      <w:r/>
       <w:hyperlink w:tooltip="#_Toc50" w:anchor="_Toc50" w:history="1">
         <w:r>
           <w:rPr>
@@ -10423,12 +10770,11 @@
           <w:fldChar w:fldCharType="begin"/>
           <w:instrText xml:space="preserve">PAGEREF _Toc50 \h</w:instrText>
           <w:fldChar w:fldCharType="separate"/>
-          <w:t xml:space="preserve">67</w:t>
+          <w:t xml:space="preserve">66</w:t>
           <w:fldChar w:fldCharType="end"/>
         </w:r>
       </w:hyperlink>
       <w:r/>
-      <w:r/>
     </w:p>
     <w:p>
       <w:pPr>
@@ -10441,7 +10787,6 @@
         <w:ind/>
         <w:rPr/>
       </w:pPr>
-      <w:r/>
       <w:hyperlink w:tooltip="#_Toc51" w:anchor="_Toc51" w:history="1">
         <w:r>
           <w:rPr>
@@ -10466,12 +10811,11 @@
           <w:fldChar w:fldCharType="begin"/>
           <w:instrText xml:space="preserve">PAGEREF _Toc51 \h</w:instrText>
           <w:fldChar w:fldCharType="separate"/>
-          <w:t xml:space="preserve">69</w:t>
+          <w:t xml:space="preserve">68</w:t>
           <w:fldChar w:fldCharType="end"/>
         </w:r>
       </w:hyperlink>
       <w:r/>
-      <w:r/>
     </w:p>
     <w:p>
       <w:pPr>
@@ -10484,7 +10828,6 @@
         <w:ind/>
         <w:rPr/>
       </w:pPr>
-      <w:r/>
       <w:hyperlink w:tooltip="#_Toc52" w:anchor="_Toc52" w:history="1">
         <w:r>
           <w:rPr>
@@ -10509,12 +10852,11 @@
           <w:fldChar w:fldCharType="begin"/>
           <w:instrText xml:space="preserve">PAGEREF _Toc52 \h</w:instrText>
           <w:fldChar w:fldCharType="separate"/>
-          <w:t xml:space="preserve">72</w:t>
+          <w:t xml:space="preserve">71</w:t>
           <w:fldChar w:fldCharType="end"/>
         </w:r>
       </w:hyperlink>
       <w:r/>
-      <w:r/>
     </w:p>
     <w:p>
       <w:pPr>
@@ -10527,7 +10869,6 @@
         <w:ind/>
         <w:rPr/>
       </w:pPr>
-      <w:r/>
       <w:hyperlink w:tooltip="#_Toc53" w:anchor="_Toc53" w:history="1">
         <w:r>
           <w:rPr>
@@ -10552,12 +10893,11 @@
           <w:fldChar w:fldCharType="begin"/>
           <w:instrText xml:space="preserve">PAGEREF _Toc53 \h</w:instrText>
           <w:fldChar w:fldCharType="separate"/>
-          <w:t xml:space="preserve">72</w:t>
+          <w:t xml:space="preserve">71</w:t>
           <w:fldChar w:fldCharType="end"/>
         </w:r>
       </w:hyperlink>
       <w:r/>
-      <w:r/>
     </w:p>
     <w:p>
       <w:pPr>
@@ -10570,7 +10910,6 @@
         <w:ind/>
         <w:rPr/>
       </w:pPr>
-      <w:r/>
       <w:hyperlink w:tooltip="#_Toc54" w:anchor="_Toc54" w:history="1">
         <w:r>
           <w:rPr>
@@ -10595,12 +10934,11 @@
           <w:fldChar w:fldCharType="begin"/>
           <w:instrText xml:space="preserve">PAGEREF _Toc54 \h</w:instrText>
           <w:fldChar w:fldCharType="separate"/>
-          <w:t xml:space="preserve">73</w:t>
+          <w:t xml:space="preserve">72</w:t>
           <w:fldChar w:fldCharType="end"/>
         </w:r>
       </w:hyperlink>
       <w:r/>
-      <w:r/>
     </w:p>
     <w:p>
       <w:pPr>
@@ -10613,7 +10951,6 @@
         <w:ind/>
         <w:rPr/>
       </w:pPr>
-      <w:r/>
       <w:hyperlink w:tooltip="#_Toc55" w:anchor="_Toc55" w:history="1">
         <w:r>
           <w:rPr>
@@ -10638,12 +10975,11 @@
           <w:fldChar w:fldCharType="begin"/>
           <w:instrText xml:space="preserve">PAGEREF _Toc55 \h</w:instrText>
           <w:fldChar w:fldCharType="separate"/>
-          <w:t xml:space="preserve">73</w:t>
+          <w:t xml:space="preserve">72</w:t>
           <w:fldChar w:fldCharType="end"/>
         </w:r>
       </w:hyperlink>
       <w:r/>
-      <w:r/>
     </w:p>
     <w:p>
       <w:pPr>
@@ -10656,7 +10992,6 @@
         <w:ind/>
         <w:rPr/>
       </w:pPr>
-      <w:r/>
       <w:hyperlink w:tooltip="#_Toc56" w:anchor="_Toc56" w:history="1">
         <w:r>
           <w:rPr>
@@ -10681,12 +11016,11 @@
           <w:fldChar w:fldCharType="begin"/>
           <w:instrText xml:space="preserve">PAGEREF _Toc56 \h</w:instrText>
           <w:fldChar w:fldCharType="separate"/>
-          <w:t xml:space="preserve">74</w:t>
+          <w:t xml:space="preserve">73</w:t>
           <w:fldChar w:fldCharType="end"/>
         </w:r>
       </w:hyperlink>
       <w:r/>
-      <w:r/>
     </w:p>
     <w:p>
       <w:pPr>
@@ -10699,7 +11033,6 @@
         <w:ind/>
         <w:rPr/>
       </w:pPr>
-      <w:r/>
       <w:hyperlink w:tooltip="#_Toc57" w:anchor="_Toc57" w:history="1">
         <w:r>
           <w:rPr>
@@ -10724,12 +11057,11 @@
           <w:fldChar w:fldCharType="begin"/>
           <w:instrText xml:space="preserve">PAGEREF _Toc57 \h</w:instrText>
           <w:fldChar w:fldCharType="separate"/>
-          <w:t xml:space="preserve">77</w:t>
+          <w:t xml:space="preserve">76</w:t>
           <w:fldChar w:fldCharType="end"/>
         </w:r>
       </w:hyperlink>
       <w:r/>
-      <w:r/>
     </w:p>
     <w:p>
       <w:pPr>
@@ -10742,7 +11074,6 @@
         <w:ind/>
         <w:rPr/>
       </w:pPr>
-      <w:r/>
       <w:hyperlink w:tooltip="#_Toc58" w:anchor="_Toc58" w:history="1">
         <w:r>
           <w:rPr>
@@ -10767,12 +11098,11 @@
           <w:fldChar w:fldCharType="begin"/>
           <w:instrText xml:space="preserve">PAGEREF _Toc58 \h</w:instrText>
           <w:fldChar w:fldCharType="separate"/>
-          <w:t xml:space="preserve">78</w:t>
+          <w:t xml:space="preserve">77</w:t>
           <w:fldChar w:fldCharType="end"/>
         </w:r>
       </w:hyperlink>
       <w:r/>
-      <w:r/>
     </w:p>
     <w:p>
       <w:pPr>
@@ -10785,7 +11115,6 @@
         <w:ind/>
         <w:rPr/>
       </w:pPr>
-      <w:r/>
       <w:hyperlink w:tooltip="#_Toc59" w:anchor="_Toc59" w:history="1">
         <w:r>
           <w:rPr>
@@ -10810,12 +11139,11 @@
           <w:fldChar w:fldCharType="begin"/>
           <w:instrText xml:space="preserve">PAGEREF _Toc59 \h</w:instrText>
           <w:fldChar w:fldCharType="separate"/>
-          <w:t xml:space="preserve">79</w:t>
+          <w:t xml:space="preserve">78</w:t>
           <w:fldChar w:fldCharType="end"/>
         </w:r>
       </w:hyperlink>
       <w:r/>
-      <w:r/>
     </w:p>
     <w:p>
       <w:pPr>
@@ -10828,7 +11156,6 @@
         <w:ind/>
         <w:rPr/>
       </w:pPr>
-      <w:r/>
       <w:hyperlink w:tooltip="#_Toc60" w:anchor="_Toc60" w:history="1">
         <w:r>
           <w:rPr>
@@ -10853,12 +11180,11 @@
           <w:fldChar w:fldCharType="begin"/>
           <w:instrText xml:space="preserve">PAGEREF _Toc60 \h</w:instrText>
           <w:fldChar w:fldCharType="separate"/>
-          <w:t xml:space="preserve">81</w:t>
+          <w:t xml:space="preserve">80</w:t>
           <w:fldChar w:fldCharType="end"/>
         </w:r>
       </w:hyperlink>
       <w:r/>
-      <w:r/>
     </w:p>
     <w:p>
       <w:pPr>
@@ -10871,7 +11197,6 @@
         <w:ind/>
         <w:rPr/>
       </w:pPr>
-      <w:r/>
       <w:hyperlink w:tooltip="#_Toc61" w:anchor="_Toc61" w:history="1">
         <w:r>
           <w:rPr>
@@ -10896,12 +11221,11 @@
           <w:fldChar w:fldCharType="begin"/>
           <w:instrText xml:space="preserve">PAGEREF _Toc61 \h</w:instrText>
           <w:fldChar w:fldCharType="separate"/>
-          <w:t xml:space="preserve">82</w:t>
+          <w:t xml:space="preserve">81</w:t>
           <w:fldChar w:fldCharType="end"/>
         </w:r>
       </w:hyperlink>
       <w:r/>
-      <w:r/>
     </w:p>
     <w:p>
       <w:pPr>
@@ -10914,7 +11238,6 @@
         <w:ind/>
         <w:rPr/>
       </w:pPr>
-      <w:r/>
       <w:hyperlink w:tooltip="#_Toc62" w:anchor="_Toc62" w:history="1">
         <w:r>
           <w:rPr>
@@ -10939,12 +11262,11 @@
           <w:fldChar w:fldCharType="begin"/>
           <w:instrText xml:space="preserve">PAGEREF _Toc62 \h</w:instrText>
           <w:fldChar w:fldCharType="separate"/>
-          <w:t xml:space="preserve">83</w:t>
+          <w:t xml:space="preserve">82</w:t>
           <w:fldChar w:fldCharType="end"/>
         </w:r>
       </w:hyperlink>
       <w:r/>
-      <w:r/>
     </w:p>
     <w:p>
       <w:pPr>
@@ -10957,7 +11279,6 @@
         <w:ind/>
         <w:rPr/>
       </w:pPr>
-      <w:r/>
       <w:hyperlink w:tooltip="#_Toc63" w:anchor="_Toc63" w:history="1">
         <w:r>
           <w:rPr>
@@ -10982,12 +11303,11 @@
           <w:fldChar w:fldCharType="begin"/>
           <w:instrText xml:space="preserve">PAGEREF _Toc63 \h</w:instrText>
           <w:fldChar w:fldCharType="separate"/>
-          <w:t xml:space="preserve">83</w:t>
+          <w:t xml:space="preserve">82</w:t>
           <w:fldChar w:fldCharType="end"/>
         </w:r>
       </w:hyperlink>
       <w:r/>
-      <w:r/>
     </w:p>
     <w:p>
       <w:pPr>
@@ -11000,7 +11320,6 @@
         <w:ind/>
         <w:rPr/>
       </w:pPr>
-      <w:r/>
       <w:hyperlink w:tooltip="#_Toc64" w:anchor="_Toc64" w:history="1">
         <w:r>
           <w:rPr>
@@ -11025,12 +11344,11 @@
           <w:fldChar w:fldCharType="begin"/>
           <w:instrText xml:space="preserve">PAGEREF _Toc64 \h</w:instrText>
           <w:fldChar w:fldCharType="separate"/>
-          <w:t xml:space="preserve">84</w:t>
+          <w:t xml:space="preserve">83</w:t>
           <w:fldChar w:fldCharType="end"/>
         </w:r>
       </w:hyperlink>
       <w:r/>
-      <w:r/>
     </w:p>
     <w:p>
       <w:pPr>
@@ -11043,7 +11361,6 @@
         <w:ind/>
         <w:rPr/>
       </w:pPr>
-      <w:r/>
       <w:hyperlink w:tooltip="#_Toc65" w:anchor="_Toc65" w:history="1">
         <w:r>
           <w:rPr>
@@ -11068,12 +11385,11 @@
           <w:fldChar w:fldCharType="begin"/>
           <w:instrText xml:space="preserve">PAGEREF _Toc65 \h</w:instrText>
           <w:fldChar w:fldCharType="separate"/>
-          <w:t xml:space="preserve">85</w:t>
+          <w:t xml:space="preserve">84</w:t>
           <w:fldChar w:fldCharType="end"/>
         </w:r>
       </w:hyperlink>
       <w:r/>
-      <w:r/>
     </w:p>
     <w:p>
       <w:pPr>
@@ -11086,7 +11402,6 @@
         <w:ind/>
         <w:rPr/>
       </w:pPr>
-      <w:r/>
       <w:hyperlink w:tooltip="#_Toc66" w:anchor="_Toc66" w:history="1">
         <w:r>
           <w:rPr>
@@ -11111,12 +11426,11 @@
           <w:fldChar w:fldCharType="begin"/>
           <w:instrText xml:space="preserve">PAGEREF _Toc66 \h</w:instrText>
           <w:fldChar w:fldCharType="separate"/>
-          <w:t xml:space="preserve">86</w:t>
+          <w:t xml:space="preserve">85</w:t>
           <w:fldChar w:fldCharType="end"/>
         </w:r>
       </w:hyperlink>
       <w:r/>
-      <w:r/>
     </w:p>
     <w:p>
       <w:pPr>
@@ -11129,7 +11443,6 @@
         <w:ind/>
         <w:rPr/>
       </w:pPr>
-      <w:r/>
       <w:hyperlink w:tooltip="#_Toc67" w:anchor="_Toc67" w:history="1">
         <w:r>
           <w:rPr>
@@ -11154,12 +11467,11 @@
           <w:fldChar w:fldCharType="begin"/>
           <w:instrText xml:space="preserve">PAGEREF _Toc67 \h</w:instrText>
           <w:fldChar w:fldCharType="separate"/>
-          <w:t xml:space="preserve">88</w:t>
+          <w:t xml:space="preserve">87</w:t>
           <w:fldChar w:fldCharType="end"/>
         </w:r>
       </w:hyperlink>
       <w:r/>
-      <w:r/>
     </w:p>
     <w:p>
       <w:pPr>
@@ -11172,7 +11484,6 @@
         <w:ind/>
         <w:rPr/>
       </w:pPr>
-      <w:r/>
       <w:hyperlink w:tooltip="#_Toc68" w:anchor="_Toc68" w:history="1">
         <w:r>
           <w:rPr>
@@ -11197,12 +11508,11 @@
           <w:fldChar w:fldCharType="begin"/>
           <w:instrText xml:space="preserve">PAGEREF _Toc68 \h</w:instrText>
           <w:fldChar w:fldCharType="separate"/>
-          <w:t xml:space="preserve">88</w:t>
+          <w:t xml:space="preserve">87</w:t>
           <w:fldChar w:fldCharType="end"/>
         </w:r>
       </w:hyperlink>
       <w:r/>
-      <w:r/>
     </w:p>
     <w:p>
       <w:pPr>
@@ -11215,7 +11525,6 @@
         <w:ind/>
         <w:rPr/>
       </w:pPr>
-      <w:r/>
       <w:hyperlink w:tooltip="#_Toc69" w:anchor="_Toc69" w:history="1">
         <w:r>
           <w:rPr>
@@ -11240,12 +11549,11 @@
           <w:fldChar w:fldCharType="begin"/>
           <w:instrText xml:space="preserve">PAGEREF _Toc69 \h</w:instrText>
           <w:fldChar w:fldCharType="separate"/>
-          <w:t xml:space="preserve">88</w:t>
+          <w:t xml:space="preserve">87</w:t>
           <w:fldChar w:fldCharType="end"/>
         </w:r>
       </w:hyperlink>
       <w:r/>
-      <w:r/>
     </w:p>
     <w:p>
       <w:pPr>
@@ -11258,7 +11566,6 @@
         <w:ind/>
         <w:rPr/>
       </w:pPr>
-      <w:r/>
       <w:hyperlink w:tooltip="#_Toc70" w:anchor="_Toc70" w:history="1">
         <w:r>
           <w:rPr>
@@ -11283,12 +11590,11 @@
           <w:fldChar w:fldCharType="begin"/>
           <w:instrText xml:space="preserve">PAGEREF _Toc70 \h</w:instrText>
           <w:fldChar w:fldCharType="separate"/>
-          <w:t xml:space="preserve">88</w:t>
+          <w:t xml:space="preserve">87</w:t>
           <w:fldChar w:fldCharType="end"/>
         </w:r>
       </w:hyperlink>
       <w:r/>
-      <w:r/>
     </w:p>
     <w:p>
       <w:pPr>
@@ -11301,7 +11607,6 @@
         <w:ind/>
         <w:rPr/>
       </w:pPr>
-      <w:r/>
       <w:hyperlink w:tooltip="#_Toc71" w:anchor="_Toc71" w:history="1">
         <w:r>
           <w:rPr>
@@ -11326,12 +11631,11 @@
           <w:fldChar w:fldCharType="begin"/>
           <w:instrText xml:space="preserve">PAGEREF _Toc71 \h</w:instrText>
           <w:fldChar w:fldCharType="separate"/>
-          <w:t xml:space="preserve">88</w:t>
+          <w:t xml:space="preserve">87</w:t>
           <w:fldChar w:fldCharType="end"/>
         </w:r>
       </w:hyperlink>
       <w:r/>
-      <w:r/>
     </w:p>
     <w:p>
       <w:pPr>
@@ -11344,7 +11648,6 @@
         <w:ind/>
         <w:rPr/>
       </w:pPr>
-      <w:r/>
       <w:hyperlink w:tooltip="#_Toc72" w:anchor="_Toc72" w:history="1">
         <w:r>
           <w:rPr>
@@ -11369,12 +11672,11 @@
           <w:fldChar w:fldCharType="begin"/>
           <w:instrText xml:space="preserve">PAGEREF _Toc72 \h</w:instrText>
           <w:fldChar w:fldCharType="separate"/>
-          <w:t xml:space="preserve">88</w:t>
+          <w:t xml:space="preserve">87</w:t>
           <w:fldChar w:fldCharType="end"/>
         </w:r>
       </w:hyperlink>
       <w:r/>
-      <w:r/>
     </w:p>
     <w:p>
       <w:pPr>
@@ -11387,7 +11689,6 @@
         <w:ind/>
         <w:rPr/>
       </w:pPr>
-      <w:r/>
       <w:hyperlink w:tooltip="#_Toc73" w:anchor="_Toc73" w:history="1">
         <w:r>
           <w:rPr>
@@ -11412,12 +11713,11 @@
           <w:fldChar w:fldCharType="begin"/>
           <w:instrText xml:space="preserve">PAGEREF _Toc73 \h</w:instrText>
           <w:fldChar w:fldCharType="separate"/>
-          <w:t xml:space="preserve">88</w:t>
+          <w:t xml:space="preserve">87</w:t>
           <w:fldChar w:fldCharType="end"/>
         </w:r>
       </w:hyperlink>
       <w:r/>
-      <w:r/>
     </w:p>
     <w:p>
       <w:pPr>
@@ -11430,7 +11730,6 @@
         <w:ind/>
         <w:rPr/>
       </w:pPr>
-      <w:r/>
       <w:hyperlink w:tooltip="#_Toc74" w:anchor="_Toc74" w:history="1">
         <w:r>
           <w:rPr>
@@ -11455,12 +11754,11 @@
           <w:fldChar w:fldCharType="begin"/>
           <w:instrText xml:space="preserve">PAGEREF _Toc74 \h</w:instrText>
           <w:fldChar w:fldCharType="separate"/>
-          <w:t xml:space="preserve">88</w:t>
+          <w:t xml:space="preserve">87</w:t>
           <w:fldChar w:fldCharType="end"/>
         </w:r>
       </w:hyperlink>
       <w:r/>
-      <w:r/>
     </w:p>
     <w:p>
       <w:pPr>
@@ -11473,7 +11771,6 @@
         <w:ind/>
         <w:rPr/>
       </w:pPr>
-      <w:r/>
       <w:hyperlink w:tooltip="#_Toc75" w:anchor="_Toc75" w:history="1">
         <w:r>
           <w:rPr>
@@ -11498,12 +11795,11 @@
           <w:fldChar w:fldCharType="begin"/>
           <w:instrText xml:space="preserve">PAGEREF _Toc75 \h</w:instrText>
           <w:fldChar w:fldCharType="separate"/>
-          <w:t xml:space="preserve">88</w:t>
+          <w:t xml:space="preserve">87</w:t>
           <w:fldChar w:fldCharType="end"/>
         </w:r>
       </w:hyperlink>
       <w:r/>
-      <w:r/>
     </w:p>
     <w:p>
       <w:pPr>
@@ -11516,7 +11812,6 @@
         <w:ind/>
         <w:rPr/>
       </w:pPr>
-      <w:r/>
       <w:hyperlink w:tooltip="#_Toc76" w:anchor="_Toc76" w:history="1">
         <w:r>
           <w:rPr>
@@ -11541,12 +11836,11 @@
           <w:fldChar w:fldCharType="begin"/>
           <w:instrText xml:space="preserve">PAGEREF _Toc76 \h</w:instrText>
           <w:fldChar w:fldCharType="separate"/>
-          <w:t xml:space="preserve">92</w:t>
+          <w:t xml:space="preserve">91</w:t>
           <w:fldChar w:fldCharType="end"/>
         </w:r>
       </w:hyperlink>
       <w:r/>
-      <w:r/>
     </w:p>
     <w:p>
       <w:pPr>
@@ -11559,7 +11853,6 @@
         <w:ind/>
         <w:rPr/>
       </w:pPr>
-      <w:r/>
       <w:hyperlink w:tooltip="#_Toc77" w:anchor="_Toc77" w:history="1">
         <w:r>
           <w:rPr>
@@ -11584,12 +11877,11 @@
           <w:fldChar w:fldCharType="begin"/>
           <w:instrText xml:space="preserve">PAGEREF _Toc77 \h</w:instrText>
           <w:fldChar w:fldCharType="separate"/>
-          <w:t xml:space="preserve">95</w:t>
+          <w:t xml:space="preserve">94</w:t>
           <w:fldChar w:fldCharType="end"/>
         </w:r>
       </w:hyperlink>
       <w:r/>
-      <w:r/>
     </w:p>
     <w:p>
       <w:pPr>
@@ -11602,7 +11894,6 @@
         <w:ind/>
         <w:rPr/>
       </w:pPr>
-      <w:r/>
       <w:hyperlink w:tooltip="#_Toc78" w:anchor="_Toc78" w:history="1">
         <w:r>
           <w:rPr>
@@ -11627,12 +11918,11 @@
           <w:fldChar w:fldCharType="begin"/>
           <w:instrText xml:space="preserve">PAGEREF _Toc78 \h</w:instrText>
           <w:fldChar w:fldCharType="separate"/>
-          <w:t xml:space="preserve">96</w:t>
+          <w:t xml:space="preserve">95</w:t>
           <w:fldChar w:fldCharType="end"/>
         </w:r>
       </w:hyperlink>
       <w:r/>
-      <w:r/>
     </w:p>
     <w:p>
       <w:pPr>
@@ -11645,7 +11935,6 @@
         <w:ind/>
         <w:rPr/>
       </w:pPr>
-      <w:r/>
       <w:hyperlink w:tooltip="#_Toc79" w:anchor="_Toc79" w:history="1">
         <w:r>
           <w:rPr>
@@ -11670,12 +11959,11 @@
           <w:fldChar w:fldCharType="begin"/>
           <w:instrText xml:space="preserve">PAGEREF _Toc79 \h</w:instrText>
           <w:fldChar w:fldCharType="separate"/>
-          <w:t xml:space="preserve">97</w:t>
+          <w:t xml:space="preserve">96</w:t>
           <w:fldChar w:fldCharType="end"/>
         </w:r>
       </w:hyperlink>
       <w:r/>
-      <w:r/>
     </w:p>
     <w:p>
       <w:pPr>
@@ -11688,7 +11976,6 @@
         <w:ind/>
         <w:rPr/>
       </w:pPr>
-      <w:r/>
       <w:hyperlink w:tooltip="#_Toc80" w:anchor="_Toc80" w:history="1">
         <w:r>
           <w:rPr>
@@ -11713,12 +12000,11 @@
           <w:fldChar w:fldCharType="begin"/>
           <w:instrText xml:space="preserve">PAGEREF _Toc80 \h</w:instrText>
           <w:fldChar w:fldCharType="separate"/>
-          <w:t xml:space="preserve">98</w:t>
+          <w:t xml:space="preserve">97</w:t>
           <w:fldChar w:fldCharType="end"/>
         </w:r>
       </w:hyperlink>
       <w:r/>
-      <w:r/>
     </w:p>
     <w:p>
       <w:pPr>
@@ -11731,7 +12017,6 @@
         <w:ind/>
         <w:rPr/>
       </w:pPr>
-      <w:r/>
       <w:hyperlink w:tooltip="#_Toc81" w:anchor="_Toc81" w:history="1">
         <w:r>
           <w:rPr>
@@ -11756,12 +12041,11 @@
           <w:fldChar w:fldCharType="begin"/>
           <w:instrText xml:space="preserve">PAGEREF _Toc81 \h</w:instrText>
           <w:fldChar w:fldCharType="separate"/>
-          <w:t xml:space="preserve">98</w:t>
+          <w:t xml:space="preserve">97</w:t>
           <w:fldChar w:fldCharType="end"/>
         </w:r>
       </w:hyperlink>
       <w:r/>
-      <w:r/>
     </w:p>
     <w:p>
       <w:pPr>
@@ -11774,7 +12058,6 @@
         <w:ind/>
         <w:rPr/>
       </w:pPr>
-      <w:r/>
       <w:hyperlink w:tooltip="#_Toc82" w:anchor="_Toc82" w:history="1">
         <w:r>
           <w:rPr>
@@ -11799,12 +12082,11 @@
           <w:fldChar w:fldCharType="begin"/>
           <w:instrText xml:space="preserve">PAGEREF _Toc82 \h</w:instrText>
           <w:fldChar w:fldCharType="separate"/>
-          <w:t xml:space="preserve">99</w:t>
+          <w:t xml:space="preserve">98</w:t>
           <w:fldChar w:fldCharType="end"/>
         </w:r>
       </w:hyperlink>
       <w:r/>
-      <w:r/>
     </w:p>
     <w:p>
       <w:pPr>
@@ -11817,7 +12099,6 @@
         <w:ind/>
         <w:rPr/>
       </w:pPr>
-      <w:r/>
       <w:hyperlink w:tooltip="#_Toc83" w:anchor="_Toc83" w:history="1">
         <w:r>
           <w:rPr>
@@ -11842,12 +12123,11 @@
           <w:fldChar w:fldCharType="begin"/>
           <w:instrText xml:space="preserve">PAGEREF _Toc83 \h</w:instrText>
           <w:fldChar w:fldCharType="separate"/>
-          <w:t xml:space="preserve">100</w:t>
+          <w:t xml:space="preserve">99</w:t>
           <w:fldChar w:fldCharType="end"/>
         </w:r>
       </w:hyperlink>
       <w:r/>
-      <w:r/>
     </w:p>
     <w:p>
       <w:pPr>
@@ -11860,7 +12140,6 @@
         <w:ind/>
         <w:rPr/>
       </w:pPr>
-      <w:r/>
       <w:hyperlink w:tooltip="#_Toc84" w:anchor="_Toc84" w:history="1">
         <w:r>
           <w:rPr>
@@ -11885,12 +12164,11 @@
           <w:fldChar w:fldCharType="begin"/>
           <w:instrText xml:space="preserve">PAGEREF _Toc84 \h</w:instrText>
           <w:fldChar w:fldCharType="separate"/>
-          <w:t xml:space="preserve">101</w:t>
+          <w:t xml:space="preserve">100</w:t>
           <w:fldChar w:fldCharType="end"/>
         </w:r>
       </w:hyperlink>
       <w:r/>
-      <w:r/>
     </w:p>
     <w:p>
       <w:pPr>
@@ -11903,7 +12181,6 @@
         <w:ind/>
         <w:rPr/>
       </w:pPr>
-      <w:r/>
       <w:hyperlink w:tooltip="#_Toc85" w:anchor="_Toc85" w:history="1">
         <w:r>
           <w:rPr>
@@ -11928,12 +12205,11 @@
           <w:fldChar w:fldCharType="begin"/>
           <w:instrText xml:space="preserve">PAGEREF _Toc85 \h</w:instrText>
           <w:fldChar w:fldCharType="separate"/>
-          <w:t xml:space="preserve">101</w:t>
+          <w:t xml:space="preserve">100</w:t>
           <w:fldChar w:fldCharType="end"/>
         </w:r>
       </w:hyperlink>
       <w:r/>
-      <w:r/>
     </w:p>
     <w:p>
       <w:pPr>
@@ -11946,7 +12222,6 @@
         <w:ind/>
         <w:rPr/>
       </w:pPr>
-      <w:r/>
       <w:hyperlink w:tooltip="#_Toc86" w:anchor="_Toc86" w:history="1">
         <w:r>
           <w:rPr>
@@ -11971,12 +12246,11 @@
           <w:fldChar w:fldCharType="begin"/>
           <w:instrText xml:space="preserve">PAGEREF _Toc86 \h</w:instrText>
           <w:fldChar w:fldCharType="separate"/>
-          <w:t xml:space="preserve">101</w:t>
+          <w:t xml:space="preserve">100</w:t>
           <w:fldChar w:fldCharType="end"/>
         </w:r>
       </w:hyperlink>
       <w:r/>
-      <w:r/>
     </w:p>
     <w:p>
       <w:pPr>
@@ -11989,7 +12263,6 @@
         <w:ind/>
         <w:rPr/>
       </w:pPr>
-      <w:r/>
       <w:hyperlink w:tooltip="#_Toc87" w:anchor="_Toc87" w:history="1">
         <w:r>
           <w:rPr>
@@ -12014,12 +12287,11 @@
           <w:fldChar w:fldCharType="begin"/>
           <w:instrText xml:space="preserve">PAGEREF _Toc87 \h</w:instrText>
           <w:fldChar w:fldCharType="separate"/>
-          <w:t xml:space="preserve">101</w:t>
+          <w:t xml:space="preserve">100</w:t>
           <w:fldChar w:fldCharType="end"/>
         </w:r>
       </w:hyperlink>
       <w:r/>
-      <w:r/>
     </w:p>
     <w:p>
       <w:pPr>
@@ -12032,7 +12304,6 @@
         <w:ind/>
         <w:rPr/>
       </w:pPr>
-      <w:r/>
       <w:hyperlink w:tooltip="#_Toc88" w:anchor="_Toc88" w:history="1">
         <w:r>
           <w:rPr>
@@ -12057,11 +12328,10 @@
           <w:fldChar w:fldCharType="begin"/>
           <w:instrText xml:space="preserve">PAGEREF _Toc88 \h</w:instrText>
           <w:fldChar w:fldCharType="separate"/>
-          <w:t xml:space="preserve">101</w:t>
+          <w:t xml:space="preserve">100</w:t>
           <w:fldChar w:fldCharType="end"/>
         </w:r>
       </w:hyperlink>
-      <w:r/>
       <w:r/>
     </w:p>
     <w:p>
@@ -12093,6 +12363,7 @@
         <w:fldChar w:fldCharType="end"/>
       </w:r>
       <w:r/>
+      <w:r/>
     </w:p>
     <w:p>
       <w:pPr>
@@ -12102,10 +12373,15 @@
         <w:ind/>
         <w:rPr/>
       </w:pPr>
+      <w:r/>
+      <w:bookmarkStart w:id="1" w:name="_Toc1"/>
       <w:r>
         <w:t xml:space="preserve">1 INTRODUÇÃO</w:t>
       </w:r>
       <w:r/>
+      <w:bookmarkEnd w:id="1"/>
+      <w:r/>
+      <w:r/>
     </w:p>
     <w:p>
       <w:pPr>
@@ -12307,9 +12583,14 @@
         <w:ind/>
         <w:rPr/>
       </w:pPr>
+      <w:r/>
+      <w:bookmarkStart w:id="2" w:name="_Toc2"/>
       <w:r>
         <w:t xml:space="preserve">2 REVISÃO BIBLIOGRÁFICA</w:t>
       </w:r>
+      <w:r/>
+      <w:bookmarkEnd w:id="2"/>
+      <w:r/>
       <w:r/>
     </w:p>
     <w:p>
@@ -12356,9 +12637,14 @@
         <w:ind/>
         <w:rPr/>
       </w:pPr>
+      <w:r/>
+      <w:bookmarkStart w:id="3" w:name="_Toc3"/>
       <w:r>
         <w:t xml:space="preserve">2.1 CIDADES INTELIGENTES E RESILIENTES </w:t>
       </w:r>
+      <w:r/>
+      <w:bookmarkEnd w:id="3"/>
+      <w:r/>
       <w:r/>
     </w:p>
     <w:p>
@@ -12475,9 +12761,14 @@
         <w:ind/>
         <w:rPr/>
       </w:pPr>
+      <w:r/>
+      <w:bookmarkStart w:id="4" w:name="_Toc4"/>
       <w:r>
         <w:t xml:space="preserve">2.1.1 Fundamentos de Cidade Resiliente</w:t>
       </w:r>
+      <w:r/>
+      <w:bookmarkEnd w:id="4"/>
+      <w:r/>
       <w:r/>
     </w:p>
     <w:p>
@@ -12565,9 +12856,14 @@
         <w:ind/>
         <w:rPr/>
       </w:pPr>
+      <w:r/>
+      <w:bookmarkStart w:id="5" w:name="_Toc5"/>
       <w:r>
         <w:t xml:space="preserve">2.1.2 Zeladoria Pública e Gestão de Serviços</w:t>
       </w:r>
+      <w:r/>
+      <w:bookmarkEnd w:id="5"/>
+      <w:r/>
       <w:r/>
     </w:p>
     <w:p>
@@ -12622,10 +12918,15 @@
         <w:ind/>
         <w:rPr/>
       </w:pPr>
+      <w:r/>
+      <w:bookmarkStart w:id="6" w:name="_Toc6"/>
       <w:r>
         <w:t xml:space="preserve">2.1.3 Participação Cidadã por meio de Sistemas de Informação Automatizados</w:t>
       </w:r>
       <w:r/>
+      <w:bookmarkEnd w:id="6"/>
+      <w:r/>
+      <w:r/>
     </w:p>
     <w:p>
       <w:pPr>
@@ -12810,12 +13111,17 @@
         <w:ind/>
         <w:rPr/>
       </w:pPr>
+      <w:r/>
+      <w:bookmarkStart w:id="7" w:name="_Toc7"/>
       <w:r>
         <w:rPr>
           <w:caps w:val="0"/>
         </w:rPr>
         <w:t xml:space="preserve">2.2 TRABALHOS RELACIONADOS</w:t>
       </w:r>
+      <w:r/>
+      <w:bookmarkEnd w:id="7"/>
+      <w:r/>
       <w:r/>
     </w:p>
     <w:p>
@@ -12998,6 +13304,7 @@
         <w:ind/>
         <w:rPr/>
       </w:pPr>
+      <w:r/>
       <w:r>
         <w:t xml:space="preserve">FIGURA </w:t>
       </w:r>
@@ -13013,6 +13320,7 @@
       <w:r>
         <w:t xml:space="preserve">1</w:t>
       </w:r>
+      <w:r/>
       <w:r>
         <w:fldChar w:fldCharType="end"/>
       </w:r>
@@ -13022,6 +13330,8 @@
       <w:r>
         <w:t xml:space="preserve">Colab</w:t>
       </w:r>
+      <w:r/>
+      <w:r/>
       <w:r/>
     </w:p>
     <w:p>
@@ -13156,6 +13466,7 @@
         <w:ind/>
         <w:rPr/>
       </w:pPr>
+      <w:r/>
       <w:r>
         <w:t xml:space="preserve">FIGURA </w:t>
       </w:r>
@@ -13171,6 +13482,7 @@
       <w:r>
         <w:t xml:space="preserve">2</w:t>
       </w:r>
+      <w:r/>
       <w:r>
         <w:fldChar w:fldCharType="end"/>
       </w:r>
@@ -13189,6 +13501,8 @@
       <w:r>
         <w:t xml:space="preserve">Colab</w:t>
       </w:r>
+      <w:r/>
+      <w:r/>
       <w:r/>
     </w:p>
     <w:p>
@@ -13409,6 +13723,7 @@
         <w:ind/>
         <w:rPr/>
       </w:pPr>
+      <w:r/>
       <w:r>
         <w:t xml:space="preserve">FIGURA </w:t>
       </w:r>
@@ -13424,12 +13739,15 @@
       <w:r>
         <w:t xml:space="preserve">3</w:t>
       </w:r>
+      <w:r/>
       <w:r>
         <w:fldChar w:fldCharType="end"/>
       </w:r>
       <w:r>
         <w:t xml:space="preserve"> - Seleção da unidade da federação na plataforma e-Ouve </w:t>
       </w:r>
+      <w:r/>
+      <w:r/>
       <w:r/>
     </w:p>
     <w:p>
@@ -13562,6 +13880,7 @@
         <w:ind/>
         <w:rPr/>
       </w:pPr>
+      <w:r/>
       <w:r>
         <w:t xml:space="preserve">FIGURA </w:t>
       </w:r>
@@ -13577,12 +13896,15 @@
       <w:r>
         <w:t xml:space="preserve">4</w:t>
       </w:r>
+      <w:r/>
       <w:r>
         <w:fldChar w:fldCharType="end"/>
       </w:r>
       <w:r>
         <w:t xml:space="preserve"> - Seleção de serviços na plataforma e-Ouve</w:t>
       </w:r>
+      <w:r/>
+      <w:r/>
       <w:r/>
     </w:p>
     <w:p>
@@ -13693,10 +14015,15 @@
         <w:ind/>
         <w:rPr/>
       </w:pPr>
+      <w:r/>
+      <w:bookmarkStart w:id="8" w:name="_Toc8"/>
       <w:r>
         <w:t xml:space="preserve">3 OBJETIVO DO PROJETO</w:t>
       </w:r>
       <w:r/>
+      <w:bookmarkEnd w:id="8"/>
+      <w:r/>
+      <w:r/>
     </w:p>
     <w:p>
       <w:pPr>
@@ -13728,9 +14055,14 @@
         <w:ind/>
         <w:rPr/>
       </w:pPr>
+      <w:r/>
+      <w:bookmarkStart w:id="9" w:name="_Toc9"/>
       <w:r>
         <w:t xml:space="preserve">3.1 FORMULAÇÃO DO PROBLEMA</w:t>
       </w:r>
+      <w:r/>
+      <w:bookmarkEnd w:id="9"/>
+      <w:r/>
       <w:r/>
     </w:p>
     <w:p>
@@ -13815,9 +14147,14 @@
         <w:ind/>
         <w:rPr/>
       </w:pPr>
+      <w:r/>
+      <w:bookmarkStart w:id="10" w:name="_Toc10"/>
       <w:r>
         <w:t xml:space="preserve">3.2 OBJETIVOS </w:t>
       </w:r>
+      <w:r/>
+      <w:bookmarkEnd w:id="10"/>
+      <w:r/>
       <w:r/>
     </w:p>
     <w:p>
@@ -13951,9 +14288,14 @@
         <w:ind/>
         <w:rPr/>
       </w:pPr>
+      <w:r/>
+      <w:bookmarkStart w:id="11" w:name="_Toc11"/>
       <w:r>
         <w:t xml:space="preserve">3.3 JUSTIFICATIVA </w:t>
       </w:r>
+      <w:r/>
+      <w:bookmarkEnd w:id="11"/>
+      <w:r/>
       <w:r/>
     </w:p>
     <w:p>
@@ -14014,10 +14356,15 @@
         <w:ind/>
         <w:rPr/>
       </w:pPr>
+      <w:r/>
+      <w:bookmarkStart w:id="12" w:name="_Toc12"/>
       <w:r>
         <w:t xml:space="preserve">3.4 NÍVEIS DE DECISÃO E GRUPOS FUNCIONAIS ATENDIDOS</w:t>
       </w:r>
       <w:r/>
+      <w:bookmarkEnd w:id="12"/>
+      <w:r/>
+      <w:r/>
     </w:p>
     <w:p>
       <w:pPr>
@@ -14084,10 +14431,15 @@
         <w:ind/>
         <w:rPr/>
       </w:pPr>
+      <w:r/>
+      <w:bookmarkStart w:id="13" w:name="_Toc13"/>
       <w:r>
         <w:t xml:space="preserve">3.5 ADERÊNCIA AOS OBJETIVOS DO DESENVOLVIMENTO SUSTENTÁVEL (ODS)</w:t>
       </w:r>
       <w:r/>
+      <w:bookmarkEnd w:id="13"/>
+      <w:r/>
+      <w:r/>
     </w:p>
     <w:p>
       <w:pPr>
@@ -14269,10 +14621,15 @@
         <w:ind/>
         <w:rPr/>
       </w:pPr>
+      <w:r/>
+      <w:bookmarkStart w:id="14" w:name="_Toc14"/>
       <w:r>
         <w:t xml:space="preserve">3.6 MODELO DE NEGÓCIO PROPOSTO</w:t>
       </w:r>
       <w:r/>
+      <w:bookmarkEnd w:id="14"/>
+      <w:r/>
+      <w:r/>
     </w:p>
     <w:p>
       <w:pPr>
@@ -14479,10 +14836,15 @@
         <w:ind/>
         <w:rPr/>
       </w:pPr>
+      <w:r/>
+      <w:bookmarkStart w:id="15" w:name="_Toc15"/>
       <w:r>
         <w:t xml:space="preserve">4 MÉTODOS GERENCIAIS</w:t>
       </w:r>
       <w:r/>
+      <w:bookmarkEnd w:id="15"/>
+      <w:r/>
+      <w:r/>
     </w:p>
     <w:p>
       <w:pPr>
@@ -14514,9 +14876,14 @@
         <w:ind/>
         <w:rPr/>
       </w:pPr>
+      <w:r/>
+      <w:bookmarkStart w:id="16" w:name="_Toc16"/>
       <w:r>
         <w:t xml:space="preserve">4.1 GERENCIAMENTO DO PROJETO</w:t>
       </w:r>
+      <w:r/>
+      <w:bookmarkEnd w:id="16"/>
+      <w:r/>
       <w:r/>
     </w:p>
     <w:p>
@@ -15023,9 +15390,14 @@
         <w:ind/>
         <w:rPr/>
       </w:pPr>
+      <w:r/>
+      <w:bookmarkStart w:id="17" w:name="_Toc17"/>
       <w:r>
         <w:t xml:space="preserve">4.2 MODELO DE CICLO DE VIDA </w:t>
       </w:r>
+      <w:r/>
+      <w:bookmarkEnd w:id="17"/>
+      <w:r/>
       <w:r/>
     </w:p>
     <w:p>
@@ -15133,9 +15505,14 @@
         <w:ind/>
         <w:rPr/>
       </w:pPr>
+      <w:r/>
+      <w:bookmarkStart w:id="18" w:name="_Toc18"/>
       <w:r>
         <w:t xml:space="preserve">4.3 RECURSOS NECESSÁRIOS</w:t>
       </w:r>
+      <w:r/>
+      <w:bookmarkEnd w:id="18"/>
+      <w:r/>
       <w:r/>
     </w:p>
     <w:p>
@@ -15163,9 +15540,14 @@
         <w:ind/>
         <w:rPr/>
       </w:pPr>
+      <w:r/>
+      <w:bookmarkStart w:id="19" w:name="_Toc19"/>
       <w:r>
         <w:t xml:space="preserve">4.3.1 Recursos Humanos</w:t>
       </w:r>
+      <w:r/>
+      <w:bookmarkEnd w:id="19"/>
+      <w:r/>
       <w:r/>
     </w:p>
     <w:p>
@@ -15457,9 +15839,14 @@
         <w:ind/>
         <w:rPr/>
       </w:pPr>
+      <w:r/>
+      <w:bookmarkStart w:id="20" w:name="_Toc20"/>
       <w:r>
         <w:t xml:space="preserve">4.3.2 Recursos de Hardware</w:t>
       </w:r>
+      <w:r/>
+      <w:bookmarkEnd w:id="20"/>
+      <w:r/>
       <w:r/>
     </w:p>
     <w:p>
@@ -15564,9 +15951,14 @@
         <w:ind/>
         <w:rPr/>
       </w:pPr>
+      <w:r/>
+      <w:bookmarkStart w:id="21" w:name="_Toc21"/>
       <w:r>
         <w:t xml:space="preserve">4.3.3 Recursos de Software</w:t>
       </w:r>
+      <w:r/>
+      <w:bookmarkEnd w:id="21"/>
+      <w:r/>
       <w:r/>
     </w:p>
     <w:p>
@@ -15833,9 +16225,14 @@
         <w:ind/>
         <w:rPr/>
       </w:pPr>
+      <w:r/>
+      <w:bookmarkStart w:id="22" w:name="_Toc22"/>
       <w:r>
         <w:t xml:space="preserve">4.3.4 Outros Recursos</w:t>
       </w:r>
+      <w:r/>
+      <w:bookmarkEnd w:id="22"/>
+      <w:r/>
       <w:r/>
     </w:p>
     <w:p>
@@ -15902,9 +16299,14 @@
         <w:ind/>
         <w:rPr/>
       </w:pPr>
+      <w:r/>
+      <w:bookmarkStart w:id="23" w:name="_Toc23"/>
       <w:r>
         <w:t xml:space="preserve">4.4 RELATÓRIO DE DESEMPENHO </w:t>
       </w:r>
+      <w:r/>
+      <w:bookmarkEnd w:id="23"/>
+      <w:r/>
       <w:r/>
     </w:p>
     <w:p>
@@ -16234,9 +16636,14 @@
         <w:ind/>
         <w:rPr/>
       </w:pPr>
+      <w:r/>
+      <w:bookmarkStart w:id="24" w:name="_Toc24"/>
       <w:r>
         <w:t xml:space="preserve">4.5 GERENCIAMENTO DE CONFIGURAÇÃO</w:t>
       </w:r>
+      <w:r/>
+      <w:bookmarkEnd w:id="24"/>
+      <w:r/>
       <w:r/>
     </w:p>
     <w:p>
@@ -16270,12 +16677,17 @@
         <w:ind/>
         <w:rPr/>
       </w:pPr>
+      <w:r/>
+      <w:bookmarkStart w:id="25" w:name="_Toc25"/>
       <w:r>
         <w:t xml:space="preserve">4.5.1 Papéis e Responsabilidades</w:t>
       </w:r>
       <w:r>
         <w:tab/>
       </w:r>
+      <w:r/>
+      <w:bookmarkEnd w:id="25"/>
+      <w:r/>
       <w:r/>
     </w:p>
     <w:p>
@@ -16440,9 +16852,14 @@
         <w:ind/>
         <w:rPr/>
       </w:pPr>
+      <w:r/>
+      <w:bookmarkStart w:id="26" w:name="_Toc26"/>
       <w:r>
         <w:t xml:space="preserve">4.5.2 Identificação e Versionamento de Artefatos</w:t>
       </w:r>
+      <w:r/>
+      <w:bookmarkEnd w:id="26"/>
+      <w:r/>
       <w:r/>
     </w:p>
     <w:p>
@@ -16598,9 +17015,14 @@
         <w:ind/>
         <w:rPr/>
       </w:pPr>
+      <w:r/>
+      <w:bookmarkStart w:id="27" w:name="_Toc27"/>
       <w:r>
         <w:t xml:space="preserve">4.5.3 Organização do Repositório e Ferramentas</w:t>
       </w:r>
+      <w:r/>
+      <w:bookmarkEnd w:id="27"/>
+      <w:r/>
       <w:r/>
     </w:p>
     <w:p>
@@ -16854,6 +17276,7 @@
         <w:ind/>
         <w:rPr/>
       </w:pPr>
+      <w:r/>
       <w:r>
         <w:t xml:space="preserve">FIGURA </w:t>
       </w:r>
@@ -16869,6 +17292,7 @@
       <w:r>
         <w:t xml:space="preserve">5</w:t>
       </w:r>
+      <w:r/>
       <w:r>
         <w:fldChar w:fldCharType="end"/>
       </w:r>
@@ -16876,6 +17300,8 @@
         <w:t xml:space="preserve"> - Estrutura do repositório remoto no GitHub</w:t>
       </w:r>
       <w:r/>
+      <w:r/>
+      <w:r/>
     </w:p>
     <w:p>
       <w:pPr>
@@ -16898,10 +17324,15 @@
         <w:ind/>
         <w:rPr/>
       </w:pPr>
+      <w:r/>
+      <w:bookmarkStart w:id="28" w:name="_Toc28"/>
       <w:r>
         <w:t xml:space="preserve">5 ESPECIFICAÇÃO E ANÁLISE DOS REQUISITOS</w:t>
       </w:r>
       <w:r/>
+      <w:bookmarkEnd w:id="28"/>
+      <w:r/>
+      <w:r/>
     </w:p>
     <w:p>
       <w:pPr>
@@ -16936,10 +17367,15 @@
         <w:ind/>
         <w:rPr/>
       </w:pPr>
+      <w:r/>
+      <w:bookmarkStart w:id="29" w:name="_Toc29"/>
       <w:r>
         <w:t xml:space="preserve">5.1 REQUISITOS DO SISTEMA DE SOFTWARE</w:t>
       </w:r>
       <w:r/>
+      <w:bookmarkEnd w:id="29"/>
+      <w:r/>
+      <w:r/>
     </w:p>
     <w:p>
       <w:pPr>
@@ -16974,9 +17410,14 @@
         <w:ind/>
         <w:rPr/>
       </w:pPr>
+      <w:r/>
+      <w:bookmarkStart w:id="30" w:name="_Toc30"/>
       <w:r>
         <w:t xml:space="preserve">5.1.1 Requisitos Funcionais</w:t>
       </w:r>
+      <w:r/>
+      <w:bookmarkEnd w:id="30"/>
+      <w:r/>
       <w:r/>
     </w:p>
     <w:p>
@@ -18465,12 +18906,17 @@
         <w:ind/>
         <w:rPr/>
       </w:pPr>
+      <w:r/>
+      <w:bookmarkStart w:id="31" w:name="_Toc31"/>
       <w:r>
         <w:t xml:space="preserve">5.1.2 Requisitos </w:t>
       </w:r>
       <w:r>
         <w:t xml:space="preserve">não Funcionais</w:t>
       </w:r>
+      <w:r/>
+      <w:bookmarkEnd w:id="31"/>
+      <w:r/>
       <w:r/>
     </w:p>
     <w:p>
@@ -19842,9 +20288,14 @@
         <w:ind/>
         <w:rPr/>
       </w:pPr>
+      <w:r/>
+      <w:bookmarkStart w:id="32" w:name="_Toc32"/>
       <w:r>
         <w:t xml:space="preserve">5.1.3 Principais Regras de Negócio</w:t>
       </w:r>
+      <w:r/>
+      <w:bookmarkEnd w:id="32"/>
+      <w:r/>
       <w:r/>
     </w:p>
     <w:p>
@@ -20133,10 +20584,15 @@
         <w:ind/>
         <w:rPr/>
       </w:pPr>
+      <w:r/>
+      <w:bookmarkStart w:id="33" w:name="_Toc33"/>
       <w:r>
         <w:t xml:space="preserve">5.2 ANÁLISE DOS REQUISITOS</w:t>
       </w:r>
       <w:r/>
+      <w:bookmarkEnd w:id="33"/>
+      <w:r/>
+      <w:r/>
     </w:p>
     <w:p>
       <w:pPr>
@@ -20148,14 +20604,14 @@
           <w:color w:val="00b050"/>
         </w:rPr>
       </w:pPr>
+      <w:r/>
+      <w:bookmarkStart w:id="34" w:name="_Toc34"/>
       <w:r>
         <w:t xml:space="preserve">5.2.1 Visão Funcional</w:t>
       </w:r>
-      <w:r>
-        <w:rPr>
-          <w:color w:val="00b050"/>
-        </w:rPr>
-      </w:r>
+      <w:r/>
+      <w:bookmarkEnd w:id="34"/>
+      <w:r/>
       <w:r>
         <w:rPr>
           <w:color w:val="00b050"/>
@@ -20219,9 +20675,14 @@
         <w:ind/>
         <w:rPr/>
       </w:pPr>
+      <w:r/>
+      <w:bookmarkStart w:id="35" w:name="_Toc35"/>
       <w:r>
         <w:t xml:space="preserve">5.2.2 Modelo Conceitual dos Dados</w:t>
       </w:r>
+      <w:r/>
+      <w:bookmarkEnd w:id="35"/>
+      <w:r/>
       <w:r/>
     </w:p>
     <w:p>
@@ -20595,9 +21056,14 @@
         <w:ind/>
         <w:rPr/>
       </w:pPr>
+      <w:r/>
+      <w:bookmarkStart w:id="36" w:name="_Toc36"/>
       <w:r>
         <w:t xml:space="preserve">5.2.3 Modelo Inicial da Interface de Usuário</w:t>
       </w:r>
+      <w:r/>
+      <w:bookmarkEnd w:id="36"/>
+      <w:r/>
       <w:r/>
     </w:p>
     <w:p>
@@ -20782,9 +21248,14 @@
         <w:ind/>
         <w:rPr/>
       </w:pPr>
+      <w:r/>
+      <w:bookmarkStart w:id="37" w:name="_Toc37"/>
       <w:r>
         <w:t xml:space="preserve">6 ARQUITETURA E PROJETO DO SISTEMA DE SOFTWARE</w:t>
       </w:r>
+      <w:r/>
+      <w:bookmarkEnd w:id="37"/>
+      <w:r/>
       <w:r/>
     </w:p>
     <w:p>
@@ -20845,9 +21316,14 @@
         <w:ind/>
         <w:rPr/>
       </w:pPr>
+      <w:r/>
+      <w:bookmarkStart w:id="38" w:name="_Toc38"/>
       <w:r>
         <w:t xml:space="preserve">6.1 VISÃO ESTRUTURAL</w:t>
       </w:r>
+      <w:r/>
+      <w:bookmarkEnd w:id="38"/>
+      <w:r/>
       <w:r/>
     </w:p>
     <w:p>
@@ -20905,9 +21381,14 @@
         <w:ind/>
         <w:rPr/>
       </w:pPr>
+      <w:r/>
+      <w:bookmarkStart w:id="39" w:name="_Toc39"/>
       <w:r>
         <w:t xml:space="preserve">6.1.1 Diagrama de Pacotes</w:t>
       </w:r>
+      <w:r/>
+      <w:bookmarkEnd w:id="39"/>
+      <w:r/>
       <w:r/>
     </w:p>
     <w:p>
@@ -21154,9 +21635,14 @@
         <w:ind/>
         <w:rPr/>
       </w:pPr>
+      <w:r/>
+      <w:bookmarkStart w:id="40" w:name="_Toc40"/>
       <w:r>
         <w:t xml:space="preserve">6.1.2 Diagramas de Classes</w:t>
       </w:r>
+      <w:r/>
+      <w:bookmarkEnd w:id="40"/>
+      <w:r/>
       <w:r/>
     </w:p>
     <w:p>
@@ -21274,9 +21760,14 @@
         <w:ind/>
         <w:rPr/>
       </w:pPr>
+      <w:r/>
+      <w:bookmarkStart w:id="41" w:name="_Toc41"/>
       <w:r>
         <w:t xml:space="preserve">6.2 VISÃO COMPORTAMENTAL</w:t>
       </w:r>
+      <w:r/>
+      <w:bookmarkEnd w:id="41"/>
+      <w:r/>
       <w:r/>
     </w:p>
     <w:p>
@@ -21317,9 +21808,14 @@
         <w:ind/>
         <w:rPr/>
       </w:pPr>
+      <w:r/>
+      <w:bookmarkStart w:id="42" w:name="_Toc42"/>
       <w:r>
         <w:t xml:space="preserve">6.2.1 Projeto das Interações entre Objetos</w:t>
       </w:r>
+      <w:r/>
+      <w:bookmarkEnd w:id="42"/>
+      <w:r/>
       <w:r/>
     </w:p>
     <w:p>
@@ -21409,9 +21905,14 @@
         <w:ind/>
         <w:rPr/>
       </w:pPr>
+      <w:r/>
+      <w:bookmarkStart w:id="43" w:name="_Toc43"/>
       <w:r>
         <w:t xml:space="preserve">6.3 VISÃO DOS DADOS</w:t>
       </w:r>
+      <w:r/>
+      <w:bookmarkEnd w:id="43"/>
+      <w:r/>
       <w:r/>
     </w:p>
     <w:p>
@@ -21487,9 +21988,14 @@
         <w:ind/>
         <w:rPr/>
       </w:pPr>
+      <w:r/>
+      <w:bookmarkStart w:id="44" w:name="_Toc44"/>
       <w:r>
         <w:t xml:space="preserve">6.3.1 Modelo Lógico</w:t>
       </w:r>
+      <w:r/>
+      <w:bookmarkEnd w:id="44"/>
+      <w:r/>
       <w:r/>
     </w:p>
     <w:p>
@@ -21834,9 +22340,14 @@
         <w:ind/>
         <w:rPr/>
       </w:pPr>
+      <w:r/>
+      <w:bookmarkStart w:id="45" w:name="_Toc45"/>
       <w:r>
         <w:t xml:space="preserve">6.3.2 Dicionário de Dados do Modelo Lógico</w:t>
       </w:r>
+      <w:r/>
+      <w:bookmarkEnd w:id="45"/>
+      <w:r/>
       <w:r/>
     </w:p>
     <w:p>
@@ -21944,10 +22455,15 @@
         <w:ind/>
         <w:rPr/>
       </w:pPr>
+      <w:r/>
+      <w:bookmarkStart w:id="46" w:name="_Toc46"/>
       <w:r>
         <w:t xml:space="preserve">6.4 PROJETO DA INTERAÇÃO HUMANO-COMPUTADOR</w:t>
       </w:r>
       <w:r/>
+      <w:bookmarkEnd w:id="46"/>
+      <w:r/>
+      <w:r/>
     </w:p>
     <w:p>
       <w:pPr>
@@ -22027,9 +22543,14 @@
         <w:ind/>
         <w:rPr/>
       </w:pPr>
+      <w:r/>
+      <w:bookmarkStart w:id="47" w:name="_Toc47"/>
       <w:r>
         <w:t xml:space="preserve">6.4.1 Perfil de Usuário</w:t>
       </w:r>
+      <w:r/>
+      <w:bookmarkEnd w:id="47"/>
+      <w:r/>
       <w:r/>
     </w:p>
     <w:p>
@@ -22315,6 +22836,7 @@
         <w:ind/>
         <w:rPr/>
       </w:pPr>
+      <w:r/>
       <w:r>
         <w:t xml:space="preserve">FIGURA </w:t>
       </w:r>
@@ -22330,6 +22852,7 @@
       <w:r>
         <w:t xml:space="preserve">6</w:t>
       </w:r>
+      <w:r/>
       <w:r>
         <w:fldChar w:fldCharType="end"/>
       </w:r>
@@ -22342,6 +22865,8 @@
       <w:r>
         <w:t xml:space="preserve"> de usuário do respondente</w:t>
       </w:r>
+      <w:r/>
+      <w:r/>
       <w:r/>
     </w:p>
     <w:p>
@@ -22525,6 +23050,7 @@
         <w:ind/>
         <w:rPr/>
       </w:pPr>
+      <w:r/>
       <w:r>
         <w:t xml:space="preserve">FIGURA </w:t>
       </w:r>
@@ -22540,6 +23066,7 @@
       <w:r>
         <w:t xml:space="preserve">7</w:t>
       </w:r>
+      <w:r/>
       <w:r>
         <w:fldChar w:fldCharType="end"/>
       </w:r>
@@ -22552,6 +23079,8 @@
       <w:r>
         <w:t xml:space="preserve"> com aplicativos para registro de problemas da cidade</w:t>
       </w:r>
+      <w:r/>
+      <w:r/>
       <w:r/>
     </w:p>
     <w:p>
@@ -22701,6 +23230,7 @@
         <w:ind/>
         <w:rPr/>
       </w:pPr>
+      <w:r/>
       <w:r>
         <w:t xml:space="preserve">FIGURA </w:t>
       </w:r>
@@ -22716,6 +23246,7 @@
       <w:r>
         <w:t xml:space="preserve">8</w:t>
       </w:r>
+      <w:r/>
       <w:r>
         <w:fldChar w:fldCharType="end"/>
       </w:r>
@@ -22723,6 +23254,8 @@
         <w:t xml:space="preserve"> – Possibilidade de uso de um aplicativo para registrar ocorrências da cidade.</w:t>
       </w:r>
       <w:r/>
+      <w:r/>
+      <w:r/>
     </w:p>
     <w:p>
       <w:pPr>
@@ -22754,10 +23287,15 @@
         <w:ind/>
         <w:rPr/>
       </w:pPr>
+      <w:r/>
+      <w:bookmarkStart w:id="48" w:name="_Toc48"/>
       <w:r>
         <w:t xml:space="preserve">6.4.2 Projeto da Interface de Usuário</w:t>
       </w:r>
       <w:r/>
+      <w:bookmarkEnd w:id="48"/>
+      <w:r/>
+      <w:r/>
     </w:p>
     <w:p>
       <w:pPr>
@@ -22891,10 +23429,15 @@
         <w:ind/>
         <w:rPr/>
       </w:pPr>
+      <w:r/>
+      <w:bookmarkStart w:id="49" w:name="_Toc49"/>
       <w:r>
         <w:t xml:space="preserve">6.4.3 Heurísticas de Usabilidade</w:t>
       </w:r>
       <w:r/>
+      <w:bookmarkEnd w:id="49"/>
+      <w:r/>
+      <w:r/>
     </w:p>
     <w:p>
       <w:pPr>
@@ -23079,10 +23622,15 @@
         <w:ind/>
         <w:rPr/>
       </w:pPr>
+      <w:r/>
+      <w:bookmarkStart w:id="50" w:name="_Toc50"/>
       <w:r>
         <w:t xml:space="preserve">6.4.4 Projeto da Acessibilidade</w:t>
       </w:r>
       <w:r/>
+      <w:bookmarkEnd w:id="50"/>
+      <w:r/>
+      <w:r/>
     </w:p>
     <w:p>
       <w:pPr>
@@ -23213,9 +23761,14 @@
         <w:ind/>
         <w:rPr/>
       </w:pPr>
+      <w:r/>
+      <w:bookmarkStart w:id="51" w:name="_Toc51"/>
       <w:r>
         <w:t xml:space="preserve">6.5 PROJETO DO SISTEMA DISTRIBUÍDO</w:t>
       </w:r>
+      <w:r/>
+      <w:bookmarkEnd w:id="51"/>
+      <w:r/>
       <w:r/>
     </w:p>
     <w:p>
@@ -23471,10 +24024,15 @@
         <w:ind/>
         <w:rPr/>
       </w:pPr>
+      <w:r/>
+      <w:bookmarkStart w:id="52" w:name="_Toc52"/>
       <w:r>
         <w:t xml:space="preserve">7 IMPLEMENTAÇÃO DO SISTEMA DE SOFTWARE</w:t>
       </w:r>
       <w:r/>
+      <w:bookmarkEnd w:id="52"/>
+      <w:r/>
+      <w:r/>
     </w:p>
     <w:p>
       <w:pPr>
@@ -23509,10 +24067,15 @@
         <w:ind/>
         <w:rPr/>
       </w:pPr>
+      <w:r/>
+      <w:bookmarkStart w:id="53" w:name="_Toc53"/>
       <w:r>
         <w:t xml:space="preserve">7.1 COMPONENTES DO SISTEMA DE SOFTWARE</w:t>
       </w:r>
       <w:r/>
+      <w:bookmarkEnd w:id="53"/>
+      <w:r/>
+      <w:r/>
     </w:p>
     <w:p>
       <w:pPr>
@@ -23613,10 +24176,15 @@
         <w:ind/>
         <w:rPr/>
       </w:pPr>
+      <w:r/>
+      <w:bookmarkStart w:id="54" w:name="_Toc54"/>
       <w:r>
         <w:t xml:space="preserve">7.2 TECNOLOGIAS DE IMPLEMENTAÇÃO</w:t>
       </w:r>
       <w:r/>
+      <w:bookmarkEnd w:id="54"/>
+      <w:r/>
+      <w:r/>
     </w:p>
     <w:p>
       <w:pPr>
@@ -23648,10 +24216,15 @@
         <w:ind/>
         <w:rPr/>
       </w:pPr>
+      <w:r/>
+      <w:bookmarkStart w:id="55" w:name="_Toc55"/>
       <w:r>
         <w:t xml:space="preserve">7.2.1 Linguagens de Programação e Frameworks Adotados</w:t>
       </w:r>
       <w:r/>
+      <w:bookmarkEnd w:id="55"/>
+      <w:r/>
+      <w:r/>
     </w:p>
     <w:p>
       <w:pPr>
@@ -23737,10 +24310,15 @@
         <w:ind/>
         <w:rPr/>
       </w:pPr>
+      <w:r/>
+      <w:bookmarkStart w:id="56" w:name="_Toc56"/>
       <w:r>
         <w:t xml:space="preserve">7.2.2 Design Patterns Aplicados</w:t>
       </w:r>
       <w:r/>
+      <w:bookmarkEnd w:id="56"/>
+      <w:r/>
+      <w:r/>
     </w:p>
     <w:p>
       <w:pPr>
@@ -23976,10 +24554,15 @@
         <w:ind/>
         <w:rPr/>
       </w:pPr>
+      <w:r/>
+      <w:bookmarkStart w:id="57" w:name="_Toc57"/>
       <w:r>
         <w:t xml:space="preserve">7.2.3 Convenções e Guias para Codificação</w:t>
       </w:r>
       <w:r/>
+      <w:bookmarkEnd w:id="57"/>
+      <w:r/>
+      <w:r/>
     </w:p>
     <w:p>
       <w:pPr>
@@ -24068,10 +24651,15 @@
         <w:ind/>
         <w:rPr/>
       </w:pPr>
+      <w:r/>
+      <w:bookmarkStart w:id="58" w:name="_Toc58"/>
       <w:r>
         <w:t xml:space="preserve">7.2.4 Estrutura Física do Banco de Dados</w:t>
       </w:r>
       <w:r/>
+      <w:bookmarkEnd w:id="58"/>
+      <w:r/>
+      <w:r/>
     </w:p>
     <w:p>
       <w:pPr>
@@ -24163,10 +24751,15 @@
         <w:ind/>
         <w:rPr/>
       </w:pPr>
+      <w:r/>
+      <w:bookmarkStart w:id="59" w:name="_Toc59"/>
       <w:r>
         <w:t xml:space="preserve">7.3 ANÁLISE DE COMPLEXIDADE ALGORÍTMICA</w:t>
       </w:r>
       <w:r/>
+      <w:bookmarkEnd w:id="59"/>
+      <w:r/>
+      <w:r/>
     </w:p>
     <w:p>
       <w:pPr>
@@ -24396,10 +24989,15 @@
         <w:ind/>
         <w:rPr/>
       </w:pPr>
+      <w:r/>
+      <w:bookmarkStart w:id="60" w:name="_Toc60"/>
       <w:r>
         <w:t xml:space="preserve">8 PLANO DE TESTES</w:t>
       </w:r>
       <w:r/>
+      <w:bookmarkEnd w:id="60"/>
+      <w:r/>
+      <w:r/>
     </w:p>
     <w:p>
       <w:pPr>
@@ -24437,10 +25035,15 @@
         <w:ind/>
         <w:rPr/>
       </w:pPr>
+      <w:r/>
+      <w:bookmarkStart w:id="61" w:name="_Toc61"/>
       <w:r>
         <w:t xml:space="preserve">8.1 FINALIDADE</w:t>
       </w:r>
       <w:r/>
+      <w:bookmarkEnd w:id="61"/>
+      <w:r/>
+      <w:r/>
     </w:p>
     <w:p>
       <w:pPr>
@@ -24523,10 +25126,15 @@
         <w:ind/>
         <w:rPr/>
       </w:pPr>
+      <w:r/>
+      <w:bookmarkStart w:id="62" w:name="_Toc62"/>
       <w:r>
         <w:t xml:space="preserve">8.2 ESCOPO</w:t>
       </w:r>
       <w:r/>
+      <w:bookmarkEnd w:id="62"/>
+      <w:r/>
+      <w:r/>
     </w:p>
     <w:p>
       <w:pPr>
@@ -24558,9 +25166,14 @@
         <w:ind/>
         <w:rPr/>
       </w:pPr>
+      <w:r/>
+      <w:bookmarkStart w:id="63" w:name="_Toc63"/>
       <w:r>
         <w:t xml:space="preserve">8.2.1 Referências aos Documentos Relevantes</w:t>
       </w:r>
+      <w:r/>
+      <w:bookmarkEnd w:id="63"/>
+      <w:r/>
       <w:r/>
     </w:p>
     <w:p>
@@ -24977,7 +25590,6 @@
         <w:rPr/>
       </w:pPr>
       <w:r/>
-      <w:bookmarkStart w:id="1" w:name="_Toc1"/>
       <w:r>
         <w:t xml:space="preserve">QUADRO </w:t>
       </w:r>
@@ -24993,13 +25605,14 @@
       <w:r>
         <w:t xml:space="preserve">1</w:t>
       </w:r>
+      <w:r/>
       <w:r>
         <w:fldChar w:fldCharType="end"/>
       </w:r>
       <w:r>
         <w:t xml:space="preserve"> – Documentos relevantes para testes</w:t>
       </w:r>
-      <w:bookmarkEnd w:id="1"/>
+      <w:r/>
       <w:r/>
       <w:r/>
     </w:p>
@@ -25021,9 +25634,14 @@
         <w:ind/>
         <w:rPr/>
       </w:pPr>
+      <w:r/>
+      <w:bookmarkStart w:id="64" w:name="_Toc64"/>
       <w:r>
         <w:t xml:space="preserve">8.2.2 Ambiente para a Realização dos Testes</w:t>
       </w:r>
+      <w:r/>
+      <w:bookmarkEnd w:id="64"/>
+      <w:r/>
       <w:r/>
     </w:p>
     <w:p>
@@ -25456,7 +26074,6 @@
         <w:rPr/>
       </w:pPr>
       <w:r/>
-      <w:bookmarkStart w:id="2" w:name="_Toc2"/>
       <w:r>
         <w:t xml:space="preserve">QUADRO </w:t>
       </w:r>
@@ -25472,13 +26089,14 @@
       <w:r>
         <w:t xml:space="preserve">2</w:t>
       </w:r>
+      <w:r/>
       <w:r>
         <w:fldChar w:fldCharType="end"/>
       </w:r>
       <w:r>
         <w:t xml:space="preserve"> – Equipamentos para a realização dos testes</w:t>
       </w:r>
-      <w:bookmarkEnd w:id="2"/>
+      <w:r/>
       <w:r/>
       <w:r/>
     </w:p>
@@ -26147,7 +26765,6 @@
         <w:rPr/>
       </w:pPr>
       <w:r/>
-      <w:bookmarkStart w:id="3" w:name="_Toc3"/>
       <w:r>
         <w:t xml:space="preserve">QUADRO </w:t>
       </w:r>
@@ -26163,13 +26780,14 @@
       <w:r>
         <w:t xml:space="preserve">3</w:t>
       </w:r>
+      <w:r/>
       <w:r>
         <w:fldChar w:fldCharType="end"/>
       </w:r>
       <w:r>
         <w:t xml:space="preserve"> – Softwares para a realização dos testes</w:t>
       </w:r>
-      <w:bookmarkEnd w:id="3"/>
+      <w:r/>
       <w:r/>
       <w:r/>
     </w:p>
@@ -26191,10 +26809,15 @@
         <w:ind/>
         <w:rPr/>
       </w:pPr>
+      <w:r/>
+      <w:bookmarkStart w:id="65" w:name="_Toc65"/>
       <w:r>
         <w:t xml:space="preserve">8.3 ESPECIFICAÇÃO DOS CASOS DE TESTES</w:t>
       </w:r>
       <w:r/>
+      <w:bookmarkEnd w:id="65"/>
+      <w:r/>
+      <w:r/>
     </w:p>
     <w:p>
       <w:pPr>
@@ -26268,10 +26891,15 @@
         <w:ind/>
         <w:rPr/>
       </w:pPr>
+      <w:r/>
+      <w:bookmarkStart w:id="66" w:name="_Toc66"/>
       <w:r>
         <w:t xml:space="preserve">8.4 RESULTADOS DOS TESTES</w:t>
       </w:r>
       <w:r/>
+      <w:bookmarkEnd w:id="66"/>
+      <w:r/>
+      <w:r/>
     </w:p>
     <w:p>
       <w:pPr>
@@ -26393,10 +27021,15 @@
         <w:ind/>
         <w:rPr/>
       </w:pPr>
+      <w:r/>
+      <w:bookmarkStart w:id="67" w:name="_Toc67"/>
       <w:r>
         <w:t xml:space="preserve">9 PLANO PARA IMPLANTAÇÃO</w:t>
       </w:r>
       <w:r/>
+      <w:bookmarkEnd w:id="67"/>
+      <w:r/>
+      <w:r/>
     </w:p>
     <w:p>
       <w:pPr>
@@ -26428,10 +27061,15 @@
         <w:ind/>
         <w:rPr/>
       </w:pPr>
+      <w:r/>
+      <w:bookmarkStart w:id="68" w:name="_Toc68"/>
       <w:r>
         <w:t xml:space="preserve">9.1 METODOLOGIA</w:t>
       </w:r>
       <w:r/>
+      <w:bookmarkEnd w:id="68"/>
+      <w:r/>
+      <w:r/>
     </w:p>
     <w:p>
       <w:pPr>
@@ -26441,10 +27079,15 @@
         <w:ind/>
         <w:rPr/>
       </w:pPr>
+      <w:r/>
+      <w:bookmarkStart w:id="69" w:name="_Toc69"/>
       <w:r>
         <w:t xml:space="preserve">9.1.1 Descrição da Metodologia</w:t>
       </w:r>
       <w:r/>
+      <w:bookmarkEnd w:id="69"/>
+      <w:r/>
+      <w:r/>
     </w:p>
     <w:p>
       <w:pPr>
@@ -26454,10 +27097,15 @@
         <w:ind/>
         <w:rPr/>
       </w:pPr>
+      <w:r/>
+      <w:bookmarkStart w:id="70" w:name="_Toc70"/>
       <w:r>
         <w:t xml:space="preserve">9.1.2 Matriz de Responsabilidade</w:t>
       </w:r>
       <w:r/>
+      <w:bookmarkEnd w:id="70"/>
+      <w:r/>
+      <w:r/>
     </w:p>
     <w:p>
       <w:pPr>
@@ -26467,10 +27115,15 @@
         <w:ind/>
         <w:rPr/>
       </w:pPr>
+      <w:r/>
+      <w:bookmarkStart w:id="71" w:name="_Toc71"/>
       <w:r>
         <w:t xml:space="preserve">9.2 TREINAMENTO PREVISTO</w:t>
       </w:r>
       <w:r/>
+      <w:bookmarkEnd w:id="71"/>
+      <w:r/>
+      <w:r/>
     </w:p>
     <w:p>
       <w:pPr>
@@ -26480,10 +27133,15 @@
         <w:ind/>
         <w:rPr/>
       </w:pPr>
+      <w:r/>
+      <w:bookmarkStart w:id="72" w:name="_Toc72"/>
       <w:r>
         <w:t xml:space="preserve">9.3 CRONOGRAMA DE IMPLANTAÇÃO</w:t>
       </w:r>
       <w:r/>
+      <w:bookmarkEnd w:id="72"/>
+      <w:r/>
+      <w:r/>
     </w:p>
     <w:p>
       <w:pPr>
@@ -26493,10 +27151,15 @@
         <w:ind/>
         <w:rPr/>
       </w:pPr>
+      <w:r/>
+      <w:bookmarkStart w:id="73" w:name="_Toc73"/>
       <w:r>
         <w:t xml:space="preserve">9.4 RECURSOS DE APOIO À IMPLANTAÇÃO</w:t>
       </w:r>
       <w:r/>
+      <w:bookmarkEnd w:id="73"/>
+      <w:r/>
+      <w:r/>
     </w:p>
     <w:p>
       <w:pPr>
@@ -26506,10 +27169,15 @@
         <w:ind/>
         <w:rPr/>
       </w:pPr>
+      <w:r/>
+      <w:bookmarkStart w:id="74" w:name="_Toc74"/>
       <w:r>
         <w:t xml:space="preserve">9.5 VISÃO DA IMPLANTAÇÃO</w:t>
       </w:r>
       <w:r/>
+      <w:bookmarkEnd w:id="74"/>
+      <w:r/>
+      <w:r/>
     </w:p>
     <w:p>
       <w:pPr>
@@ -26529,9 +27197,14 @@
         <w:ind/>
         <w:rPr/>
       </w:pPr>
+      <w:r/>
+      <w:bookmarkStart w:id="75" w:name="_Toc75"/>
       <w:r>
         <w:t xml:space="preserve">10 CONCLUSÃO</w:t>
       </w:r>
+      <w:r/>
+      <w:bookmarkEnd w:id="75"/>
+      <w:r/>
       <w:r/>
     </w:p>
     <w:p>
@@ -26879,10 +27552,15 @@
         <w:ind/>
         <w:rPr/>
       </w:pPr>
+      <w:r/>
+      <w:bookmarkStart w:id="76" w:name="_Toc76"/>
       <w:r>
         <w:t xml:space="preserve">REFERÊNCIAS</w:t>
       </w:r>
       <w:r/>
+      <w:bookmarkEnd w:id="76"/>
+      <w:r/>
+      <w:r/>
     </w:p>
     <w:p>
       <w:pPr>
@@ -27220,6 +27898,8 @@
         <w:ind/>
         <w:rPr/>
       </w:pPr>
+      <w:r/>
+      <w:bookmarkStart w:id="77" w:name="_Toc77"/>
       <w:r>
         <w:br w:type="page" w:clear="all"/>
       </w:r>
@@ -27227,6 +27907,9 @@
         <w:t xml:space="preserve">OBRAS CONSULTADAS </w:t>
       </w:r>
       <w:r/>
+      <w:bookmarkEnd w:id="77"/>
+      <w:r/>
+      <w:r/>
     </w:p>
     <w:p>
       <w:pPr>
@@ -27342,6 +28025,8 @@
         <w:ind/>
         <w:rPr/>
       </w:pPr>
+      <w:r/>
+      <w:bookmarkStart w:id="78" w:name="_Toc78"/>
       <w:r>
         <w:rPr>
           <w:lang w:val="en-US"/>
@@ -27352,6 +28037,9 @@
         <w:t xml:space="preserve">APÊNDICE A – GESTÃO DO PROJETO</w:t>
       </w:r>
       <w:r/>
+      <w:bookmarkEnd w:id="78"/>
+      <w:r/>
+      <w:r/>
     </w:p>
     <w:p>
       <w:pPr>
@@ -27379,6 +28067,8 @@
         <w:ind/>
         <w:rPr/>
       </w:pPr>
+      <w:r/>
+      <w:bookmarkStart w:id="79" w:name="_Toc79"/>
       <w:r>
         <w:br w:type="page" w:clear="all"/>
       </w:r>
@@ -27386,6 +28076,9 @@
         <w:t xml:space="preserve">APÊNDICE B – RELATÓRIO DE DESEMPENHO</w:t>
       </w:r>
       <w:r/>
+      <w:bookmarkEnd w:id="79"/>
+      <w:r/>
+      <w:r/>
     </w:p>
     <w:p>
       <w:pPr>
@@ -27413,12 +28106,17 @@
         <w:ind/>
         <w:rPr/>
       </w:pPr>
+      <w:r/>
+      <w:bookmarkStart w:id="80" w:name="_Toc80"/>
       <w:r>
         <w:br w:type="page" w:clear="all"/>
       </w:r>
       <w:r>
         <w:t xml:space="preserve">APÊNDICE C – VISÃO FUNCIONAL</w:t>
       </w:r>
+      <w:r/>
+      <w:bookmarkEnd w:id="80"/>
+      <w:r/>
       <w:r/>
     </w:p>
     <w:p>
@@ -27452,10 +28150,15 @@
         <w:ind/>
         <w:rPr/>
       </w:pPr>
+      <w:r/>
+      <w:bookmarkStart w:id="81" w:name="_Toc81"/>
       <w:r>
         <w:t xml:space="preserve">APÊNDICE D – VISÃO DOS DADOS</w:t>
       </w:r>
       <w:r/>
+      <w:bookmarkEnd w:id="81"/>
+      <w:r/>
+      <w:r/>
     </w:p>
     <w:p>
       <w:pPr>
@@ -27495,10 +28198,15 @@
         <w:ind/>
         <w:rPr/>
       </w:pPr>
+      <w:r/>
+      <w:bookmarkStart w:id="82" w:name="_Toc82"/>
       <w:r>
         <w:t xml:space="preserve">APÊNDICE E – MODELO INICIAL DA INTERFACE DE USUÁRIO</w:t>
       </w:r>
       <w:r/>
+      <w:bookmarkEnd w:id="82"/>
+      <w:r/>
+      <w:r/>
     </w:p>
     <w:p>
       <w:pPr>
@@ -27549,10 +28257,15 @@
         <w:ind/>
         <w:rPr/>
       </w:pPr>
+      <w:r/>
+      <w:bookmarkStart w:id="83" w:name="_Toc83"/>
       <w:r>
         <w:t xml:space="preserve">APÊNDICE F – VISÕES ESTRUTURAL E COMPORTAMENTAL</w:t>
       </w:r>
       <w:r/>
+      <w:bookmarkEnd w:id="83"/>
+      <w:r/>
+      <w:r/>
     </w:p>
     <w:p>
       <w:pPr>
@@ -27613,10 +28326,15 @@
         <w:ind/>
         <w:rPr/>
       </w:pPr>
+      <w:r/>
+      <w:bookmarkStart w:id="84" w:name="_Toc84"/>
       <w:r>
         <w:t xml:space="preserve">APÊNDICE G – ENTREVISTAS COM USUÁRIOS</w:t>
       </w:r>
       <w:r/>
+      <w:bookmarkEnd w:id="84"/>
+      <w:r/>
+      <w:r/>
     </w:p>
     <w:p>
       <w:pPr>
@@ -27655,10 +28373,15 @@
         <w:ind/>
         <w:rPr/>
       </w:pPr>
+      <w:r/>
+      <w:bookmarkStart w:id="85" w:name="_Toc85"/>
       <w:r>
         <w:t xml:space="preserve">APÊNDICE H – MODELO DE NEGÓCIO</w:t>
       </w:r>
       <w:r/>
+      <w:bookmarkEnd w:id="85"/>
+      <w:r/>
+      <w:r/>
     </w:p>
     <w:p>
       <w:pPr>
@@ -27690,10 +28413,15 @@
         <w:ind/>
         <w:rPr/>
       </w:pPr>
+      <w:r/>
+      <w:bookmarkStart w:id="86" w:name="_Toc86"/>
       <w:r>
         <w:t xml:space="preserve">APÊNDICE I – PROJETO DO SISTEMA DISTRIBUÍDO</w:t>
       </w:r>
       <w:r/>
+      <w:bookmarkEnd w:id="86"/>
+      <w:r/>
+      <w:r/>
     </w:p>
     <w:p>
       <w:pPr>
@@ -27725,10 +28453,15 @@
         <w:ind/>
         <w:rPr/>
       </w:pPr>
+      <w:r/>
+      <w:bookmarkStart w:id="87" w:name="_Toc87"/>
       <w:r>
         <w:t xml:space="preserve">APÊNDICE J – CASOS DE TESTES</w:t>
       </w:r>
       <w:r/>
+      <w:bookmarkEnd w:id="87"/>
+      <w:r/>
+      <w:r/>
     </w:p>
     <w:p>
       <w:pPr>
@@ -27760,24 +28493,26 @@
         <w:ind/>
         <w:rPr/>
       </w:pPr>
+      <w:r/>
+      <w:bookmarkStart w:id="88" w:name="_Toc88"/>
       <w:r>
         <w:t xml:space="preserve">APÊNDICE K – RECURSOS DE APOIO À IMPLANTAÇÃO</w:t>
       </w:r>
       <w:r/>
-    </w:p>
-    <w:p>
-      <w:pPr>
-        <w:pBdr/>
-        <w:spacing/>
-        <w:ind/>
-        <w:rPr/>
-      </w:pPr>
-      <w:r>
-        <w:t xml:space="preserve">Os documentos de apoio ao usuário final estarão disponíveis na pasta “ApêndiceK” que acompanha este documento.</w:t>
-      </w:r>
-      <w:r/>
-      <w:r/>
-      <w:r/>
+      <w:bookmarkEnd w:id="88"/>
+      <w:r/>
+      <w:r/>
+    </w:p>
+    <w:p>
+      <w:pPr>
+        <w:pBdr/>
+        <w:spacing/>
+        <w:ind/>
+        <w:rPr/>
+      </w:pPr>
+      <w:r>
+        <w:t xml:space="preserve">Os documentos de apoio ao usuário final estão disponíveis na pasta “ApêndiceK” que acompanha este documento.</w:t>
+      </w:r>
       <w:r/>
     </w:p>
     <w:sectPr>

</xml_diff>

<commit_message>
doc: cria o Apendice L para a extensao a comunidade
Entrada do apendice no relatorio v1.13 e pasta com o leia-me
indicando os comprovantes esperados.
</commit_message>
<xml_diff>
--- a/FAI-SI-PFC-II-FalaCidade-2026-v1.13.docx
+++ b/FAI-SI-PFC-II-FalaCidade-2026-v1.13.docx
@@ -28515,6 +28515,36 @@
       </w:r>
       <w:r/>
     </w:p>
+    <w:p>
+      <w:pPr>
+        <w:pStyle w:val="1635"/>
+        <w:pBdr/>
+        <w:spacing/>
+        <w:ind/>
+        <w:rPr/>
+      </w:pPr>
+      <w:r/>
+      <w:bookmarkStart w:id="89" w:name="_Toc89"/>
+      <w:r>
+        <w:t xml:space="preserve">APÊNDICE L – EXTENSÃO À COMUNIDADE</w:t>
+      </w:r>
+      <w:r/>
+      <w:bookmarkEnd w:id="89"/>
+      <w:r/>
+      <w:r/>
+    </w:p>
+    <w:p>
+      <w:pPr>
+        <w:pBdr/>
+        <w:spacing/>
+        <w:ind/>
+        <w:rPr/>
+      </w:pPr>
+      <w:r>
+        <w:t xml:space="preserve">Os comprovantes das atividades de extensão à comunidade realizadas pela equipe, compreendendo o instrumento da pesquisa aplicada aos potenciais usuários do sistema e as respostas obtidas, estão disponíveis na pasta “ApêndiceL” que acompanha este documento.</w:t>
+      </w:r>
+      <w:r/>
+    </w:p>
     <w:sectPr>
       <w:headerReference w:type="default" r:id="rId14"/>
       <w:headerReference w:type="even" r:id="rId15"/>

</xml_diff>